<commit_message>
fix: pattern singleton in sessionManager
</commit_message>
<xml_diff>
--- a/docs/Carpeta de Proyecto.docx
+++ b/docs/Carpeta de Proyecto.docx
@@ -754,7 +754,11 @@
           </w:pPr>
           <w:r>
             <w:fldChar w:fldCharType="begin"/>
+          </w:r>
+          <w:r>
             <w:instrText>TOC \h \o "1-3"</w:instrText>
+          </w:r>
+          <w:r>
             <w:fldChar w:fldCharType="separate"/>
           </w:r>
           <w:hyperlink w:anchor="_Toc238057012" w:history="1">
@@ -770,10 +774,40 @@
                 <w:noProof/>
               </w:rPr>
               <w:tab/>
+            </w:r>
+            <w:r>
+              <w:rPr>
+                <w:noProof/>
+              </w:rPr>
               <w:fldChar w:fldCharType="begin"/>
+            </w:r>
+            <w:r>
+              <w:rPr>
+                <w:noProof/>
+              </w:rPr>
               <w:instrText xml:space="preserve"> PAGEREF _Toc238057012 \h </w:instrText>
+            </w:r>
+            <w:r>
+              <w:rPr>
+                <w:noProof/>
+              </w:rPr>
+            </w:r>
+            <w:r>
+              <w:rPr>
+                <w:noProof/>
+              </w:rPr>
               <w:fldChar w:fldCharType="separate"/>
+            </w:r>
+            <w:r>
+              <w:rPr>
+                <w:noProof/>
+              </w:rPr>
               <w:t>1</w:t>
+            </w:r>
+            <w:r>
+              <w:rPr>
+                <w:noProof/>
+              </w:rPr>
               <w:fldChar w:fldCharType="end"/>
             </w:r>
           </w:hyperlink>
@@ -801,10 +835,40 @@
                 <w:noProof/>
               </w:rPr>
               <w:tab/>
+            </w:r>
+            <w:r>
+              <w:rPr>
+                <w:noProof/>
+              </w:rPr>
               <w:fldChar w:fldCharType="begin"/>
+            </w:r>
+            <w:r>
+              <w:rPr>
+                <w:noProof/>
+              </w:rPr>
               <w:instrText xml:space="preserve"> PAGEREF _Toc238057013 \h </w:instrText>
+            </w:r>
+            <w:r>
+              <w:rPr>
+                <w:noProof/>
+              </w:rPr>
+            </w:r>
+            <w:r>
+              <w:rPr>
+                <w:noProof/>
+              </w:rPr>
               <w:fldChar w:fldCharType="separate"/>
+            </w:r>
+            <w:r>
+              <w:rPr>
+                <w:noProof/>
+              </w:rPr>
               <w:t>1</w:t>
+            </w:r>
+            <w:r>
+              <w:rPr>
+                <w:noProof/>
+              </w:rPr>
               <w:fldChar w:fldCharType="end"/>
             </w:r>
           </w:hyperlink>
@@ -832,10 +896,40 @@
                 <w:noProof/>
               </w:rPr>
               <w:tab/>
+            </w:r>
+            <w:r>
+              <w:rPr>
+                <w:noProof/>
+              </w:rPr>
               <w:fldChar w:fldCharType="begin"/>
+            </w:r>
+            <w:r>
+              <w:rPr>
+                <w:noProof/>
+              </w:rPr>
               <w:instrText xml:space="preserve"> PAGEREF _Toc238057014 \h </w:instrText>
+            </w:r>
+            <w:r>
+              <w:rPr>
+                <w:noProof/>
+              </w:rPr>
+            </w:r>
+            <w:r>
+              <w:rPr>
+                <w:noProof/>
+              </w:rPr>
               <w:fldChar w:fldCharType="separate"/>
+            </w:r>
+            <w:r>
+              <w:rPr>
+                <w:noProof/>
+              </w:rPr>
               <w:t>1</w:t>
+            </w:r>
+            <w:r>
+              <w:rPr>
+                <w:noProof/>
+              </w:rPr>
               <w:fldChar w:fldCharType="end"/>
             </w:r>
           </w:hyperlink>
@@ -863,10 +957,40 @@
                 <w:noProof/>
               </w:rPr>
               <w:tab/>
+            </w:r>
+            <w:r>
+              <w:rPr>
+                <w:noProof/>
+              </w:rPr>
               <w:fldChar w:fldCharType="begin"/>
+            </w:r>
+            <w:r>
+              <w:rPr>
+                <w:noProof/>
+              </w:rPr>
               <w:instrText xml:space="preserve"> PAGEREF _Toc238057015 \h </w:instrText>
+            </w:r>
+            <w:r>
+              <w:rPr>
+                <w:noProof/>
+              </w:rPr>
+            </w:r>
+            <w:r>
+              <w:rPr>
+                <w:noProof/>
+              </w:rPr>
               <w:fldChar w:fldCharType="separate"/>
+            </w:r>
+            <w:r>
+              <w:rPr>
+                <w:noProof/>
+              </w:rPr>
               <w:t>1</w:t>
+            </w:r>
+            <w:r>
+              <w:rPr>
+                <w:noProof/>
+              </w:rPr>
               <w:fldChar w:fldCharType="end"/>
             </w:r>
           </w:hyperlink>
@@ -894,10 +1018,40 @@
                 <w:noProof/>
               </w:rPr>
               <w:tab/>
+            </w:r>
+            <w:r>
+              <w:rPr>
+                <w:noProof/>
+              </w:rPr>
               <w:fldChar w:fldCharType="begin"/>
+            </w:r>
+            <w:r>
+              <w:rPr>
+                <w:noProof/>
+              </w:rPr>
               <w:instrText xml:space="preserve"> PAGEREF _Toc238057016 \h </w:instrText>
+            </w:r>
+            <w:r>
+              <w:rPr>
+                <w:noProof/>
+              </w:rPr>
+            </w:r>
+            <w:r>
+              <w:rPr>
+                <w:noProof/>
+              </w:rPr>
               <w:fldChar w:fldCharType="separate"/>
+            </w:r>
+            <w:r>
+              <w:rPr>
+                <w:noProof/>
+              </w:rPr>
               <w:t>1</w:t>
+            </w:r>
+            <w:r>
+              <w:rPr>
+                <w:noProof/>
+              </w:rPr>
               <w:fldChar w:fldCharType="end"/>
             </w:r>
           </w:hyperlink>
@@ -925,10 +1079,40 @@
                 <w:noProof/>
               </w:rPr>
               <w:tab/>
+            </w:r>
+            <w:r>
+              <w:rPr>
+                <w:noProof/>
+              </w:rPr>
               <w:fldChar w:fldCharType="begin"/>
+            </w:r>
+            <w:r>
+              <w:rPr>
+                <w:noProof/>
+              </w:rPr>
               <w:instrText xml:space="preserve"> PAGEREF _Toc238057017 \h </w:instrText>
+            </w:r>
+            <w:r>
+              <w:rPr>
+                <w:noProof/>
+              </w:rPr>
+            </w:r>
+            <w:r>
+              <w:rPr>
+                <w:noProof/>
+              </w:rPr>
               <w:fldChar w:fldCharType="separate"/>
+            </w:r>
+            <w:r>
+              <w:rPr>
+                <w:noProof/>
+              </w:rPr>
               <w:t>1</w:t>
+            </w:r>
+            <w:r>
+              <w:rPr>
+                <w:noProof/>
+              </w:rPr>
               <w:fldChar w:fldCharType="end"/>
             </w:r>
           </w:hyperlink>
@@ -956,10 +1140,40 @@
                 <w:noProof/>
               </w:rPr>
               <w:tab/>
+            </w:r>
+            <w:r>
+              <w:rPr>
+                <w:noProof/>
+              </w:rPr>
               <w:fldChar w:fldCharType="begin"/>
+            </w:r>
+            <w:r>
+              <w:rPr>
+                <w:noProof/>
+              </w:rPr>
               <w:instrText xml:space="preserve"> PAGEREF _Toc238057018 \h </w:instrText>
+            </w:r>
+            <w:r>
+              <w:rPr>
+                <w:noProof/>
+              </w:rPr>
+            </w:r>
+            <w:r>
+              <w:rPr>
+                <w:noProof/>
+              </w:rPr>
               <w:fldChar w:fldCharType="separate"/>
+            </w:r>
+            <w:r>
+              <w:rPr>
+                <w:noProof/>
+              </w:rPr>
               <w:t>1</w:t>
+            </w:r>
+            <w:r>
+              <w:rPr>
+                <w:noProof/>
+              </w:rPr>
               <w:fldChar w:fldCharType="end"/>
             </w:r>
           </w:hyperlink>
@@ -987,10 +1201,40 @@
                 <w:noProof/>
               </w:rPr>
               <w:tab/>
+            </w:r>
+            <w:r>
+              <w:rPr>
+                <w:noProof/>
+              </w:rPr>
               <w:fldChar w:fldCharType="begin"/>
+            </w:r>
+            <w:r>
+              <w:rPr>
+                <w:noProof/>
+              </w:rPr>
               <w:instrText xml:space="preserve"> PAGEREF _Toc238057019 \h </w:instrText>
+            </w:r>
+            <w:r>
+              <w:rPr>
+                <w:noProof/>
+              </w:rPr>
+            </w:r>
+            <w:r>
+              <w:rPr>
+                <w:noProof/>
+              </w:rPr>
               <w:fldChar w:fldCharType="separate"/>
+            </w:r>
+            <w:r>
+              <w:rPr>
+                <w:noProof/>
+              </w:rPr>
               <w:t>1</w:t>
+            </w:r>
+            <w:r>
+              <w:rPr>
+                <w:noProof/>
+              </w:rPr>
               <w:fldChar w:fldCharType="end"/>
             </w:r>
           </w:hyperlink>
@@ -1018,10 +1262,40 @@
                 <w:noProof/>
               </w:rPr>
               <w:tab/>
+            </w:r>
+            <w:r>
+              <w:rPr>
+                <w:noProof/>
+              </w:rPr>
               <w:fldChar w:fldCharType="begin"/>
+            </w:r>
+            <w:r>
+              <w:rPr>
+                <w:noProof/>
+              </w:rPr>
               <w:instrText xml:space="preserve"> PAGEREF _Toc238057020 \h </w:instrText>
+            </w:r>
+            <w:r>
+              <w:rPr>
+                <w:noProof/>
+              </w:rPr>
+            </w:r>
+            <w:r>
+              <w:rPr>
+                <w:noProof/>
+              </w:rPr>
               <w:fldChar w:fldCharType="separate"/>
+            </w:r>
+            <w:r>
+              <w:rPr>
+                <w:noProof/>
+              </w:rPr>
               <w:t>1</w:t>
+            </w:r>
+            <w:r>
+              <w:rPr>
+                <w:noProof/>
+              </w:rPr>
               <w:fldChar w:fldCharType="end"/>
             </w:r>
           </w:hyperlink>
@@ -1049,10 +1323,40 @@
                 <w:noProof/>
               </w:rPr>
               <w:tab/>
+            </w:r>
+            <w:r>
+              <w:rPr>
+                <w:noProof/>
+              </w:rPr>
               <w:fldChar w:fldCharType="begin"/>
+            </w:r>
+            <w:r>
+              <w:rPr>
+                <w:noProof/>
+              </w:rPr>
               <w:instrText xml:space="preserve"> PAGEREF _Toc238057021 \h </w:instrText>
+            </w:r>
+            <w:r>
+              <w:rPr>
+                <w:noProof/>
+              </w:rPr>
+            </w:r>
+            <w:r>
+              <w:rPr>
+                <w:noProof/>
+              </w:rPr>
               <w:fldChar w:fldCharType="separate"/>
+            </w:r>
+            <w:r>
+              <w:rPr>
+                <w:noProof/>
+              </w:rPr>
               <w:t>1</w:t>
+            </w:r>
+            <w:r>
+              <w:rPr>
+                <w:noProof/>
+              </w:rPr>
               <w:fldChar w:fldCharType="end"/>
             </w:r>
           </w:hyperlink>
@@ -1080,10 +1384,40 @@
                 <w:noProof/>
               </w:rPr>
               <w:tab/>
+            </w:r>
+            <w:r>
+              <w:rPr>
+                <w:noProof/>
+              </w:rPr>
               <w:fldChar w:fldCharType="begin"/>
+            </w:r>
+            <w:r>
+              <w:rPr>
+                <w:noProof/>
+              </w:rPr>
               <w:instrText xml:space="preserve"> PAGEREF _Toc238057022 \h </w:instrText>
+            </w:r>
+            <w:r>
+              <w:rPr>
+                <w:noProof/>
+              </w:rPr>
+            </w:r>
+            <w:r>
+              <w:rPr>
+                <w:noProof/>
+              </w:rPr>
               <w:fldChar w:fldCharType="separate"/>
+            </w:r>
+            <w:r>
+              <w:rPr>
+                <w:noProof/>
+              </w:rPr>
               <w:t>1</w:t>
+            </w:r>
+            <w:r>
+              <w:rPr>
+                <w:noProof/>
+              </w:rPr>
               <w:fldChar w:fldCharType="end"/>
             </w:r>
           </w:hyperlink>
@@ -1111,10 +1445,40 @@
                 <w:noProof/>
               </w:rPr>
               <w:tab/>
+            </w:r>
+            <w:r>
+              <w:rPr>
+                <w:noProof/>
+              </w:rPr>
               <w:fldChar w:fldCharType="begin"/>
+            </w:r>
+            <w:r>
+              <w:rPr>
+                <w:noProof/>
+              </w:rPr>
               <w:instrText xml:space="preserve"> PAGEREF _Toc238057023 \h </w:instrText>
+            </w:r>
+            <w:r>
+              <w:rPr>
+                <w:noProof/>
+              </w:rPr>
+            </w:r>
+            <w:r>
+              <w:rPr>
+                <w:noProof/>
+              </w:rPr>
               <w:fldChar w:fldCharType="separate"/>
+            </w:r>
+            <w:r>
+              <w:rPr>
+                <w:noProof/>
+              </w:rPr>
               <w:t>1</w:t>
+            </w:r>
+            <w:r>
+              <w:rPr>
+                <w:noProof/>
+              </w:rPr>
               <w:fldChar w:fldCharType="end"/>
             </w:r>
           </w:hyperlink>
@@ -1142,10 +1506,40 @@
                 <w:noProof/>
               </w:rPr>
               <w:tab/>
+            </w:r>
+            <w:r>
+              <w:rPr>
+                <w:noProof/>
+              </w:rPr>
               <w:fldChar w:fldCharType="begin"/>
+            </w:r>
+            <w:r>
+              <w:rPr>
+                <w:noProof/>
+              </w:rPr>
               <w:instrText xml:space="preserve"> PAGEREF _Toc238057024 \h </w:instrText>
+            </w:r>
+            <w:r>
+              <w:rPr>
+                <w:noProof/>
+              </w:rPr>
+            </w:r>
+            <w:r>
+              <w:rPr>
+                <w:noProof/>
+              </w:rPr>
               <w:fldChar w:fldCharType="separate"/>
+            </w:r>
+            <w:r>
+              <w:rPr>
+                <w:noProof/>
+              </w:rPr>
               <w:t>1</w:t>
+            </w:r>
+            <w:r>
+              <w:rPr>
+                <w:noProof/>
+              </w:rPr>
               <w:fldChar w:fldCharType="end"/>
             </w:r>
           </w:hyperlink>
@@ -1173,10 +1567,40 @@
                 <w:noProof/>
               </w:rPr>
               <w:tab/>
+            </w:r>
+            <w:r>
+              <w:rPr>
+                <w:noProof/>
+              </w:rPr>
               <w:fldChar w:fldCharType="begin"/>
+            </w:r>
+            <w:r>
+              <w:rPr>
+                <w:noProof/>
+              </w:rPr>
               <w:instrText xml:space="preserve"> PAGEREF _Toc238057025 \h </w:instrText>
+            </w:r>
+            <w:r>
+              <w:rPr>
+                <w:noProof/>
+              </w:rPr>
+            </w:r>
+            <w:r>
+              <w:rPr>
+                <w:noProof/>
+              </w:rPr>
               <w:fldChar w:fldCharType="separate"/>
+            </w:r>
+            <w:r>
+              <w:rPr>
+                <w:noProof/>
+              </w:rPr>
               <w:t>1</w:t>
+            </w:r>
+            <w:r>
+              <w:rPr>
+                <w:noProof/>
+              </w:rPr>
               <w:fldChar w:fldCharType="end"/>
             </w:r>
           </w:hyperlink>
@@ -1204,10 +1628,40 @@
                 <w:noProof/>
               </w:rPr>
               <w:tab/>
+            </w:r>
+            <w:r>
+              <w:rPr>
+                <w:noProof/>
+              </w:rPr>
               <w:fldChar w:fldCharType="begin"/>
+            </w:r>
+            <w:r>
+              <w:rPr>
+                <w:noProof/>
+              </w:rPr>
               <w:instrText xml:space="preserve"> PAGEREF _Toc238057026 \h </w:instrText>
+            </w:r>
+            <w:r>
+              <w:rPr>
+                <w:noProof/>
+              </w:rPr>
+            </w:r>
+            <w:r>
+              <w:rPr>
+                <w:noProof/>
+              </w:rPr>
               <w:fldChar w:fldCharType="separate"/>
+            </w:r>
+            <w:r>
+              <w:rPr>
+                <w:noProof/>
+              </w:rPr>
               <w:t>1</w:t>
+            </w:r>
+            <w:r>
+              <w:rPr>
+                <w:noProof/>
+              </w:rPr>
               <w:fldChar w:fldCharType="end"/>
             </w:r>
           </w:hyperlink>
@@ -1235,10 +1689,40 @@
                 <w:noProof/>
               </w:rPr>
               <w:tab/>
+            </w:r>
+            <w:r>
+              <w:rPr>
+                <w:noProof/>
+              </w:rPr>
               <w:fldChar w:fldCharType="begin"/>
+            </w:r>
+            <w:r>
+              <w:rPr>
+                <w:noProof/>
+              </w:rPr>
               <w:instrText xml:space="preserve"> PAGEREF _Toc238057027 \h </w:instrText>
+            </w:r>
+            <w:r>
+              <w:rPr>
+                <w:noProof/>
+              </w:rPr>
+            </w:r>
+            <w:r>
+              <w:rPr>
+                <w:noProof/>
+              </w:rPr>
               <w:fldChar w:fldCharType="separate"/>
+            </w:r>
+            <w:r>
+              <w:rPr>
+                <w:noProof/>
+              </w:rPr>
               <w:t>1</w:t>
+            </w:r>
+            <w:r>
+              <w:rPr>
+                <w:noProof/>
+              </w:rPr>
               <w:fldChar w:fldCharType="end"/>
             </w:r>
           </w:hyperlink>
@@ -1266,10 +1750,40 @@
                 <w:noProof/>
               </w:rPr>
               <w:tab/>
+            </w:r>
+            <w:r>
+              <w:rPr>
+                <w:noProof/>
+              </w:rPr>
               <w:fldChar w:fldCharType="begin"/>
+            </w:r>
+            <w:r>
+              <w:rPr>
+                <w:noProof/>
+              </w:rPr>
               <w:instrText xml:space="preserve"> PAGEREF _Toc238057028 \h </w:instrText>
+            </w:r>
+            <w:r>
+              <w:rPr>
+                <w:noProof/>
+              </w:rPr>
+            </w:r>
+            <w:r>
+              <w:rPr>
+                <w:noProof/>
+              </w:rPr>
               <w:fldChar w:fldCharType="separate"/>
+            </w:r>
+            <w:r>
+              <w:rPr>
+                <w:noProof/>
+              </w:rPr>
               <w:t>1</w:t>
+            </w:r>
+            <w:r>
+              <w:rPr>
+                <w:noProof/>
+              </w:rPr>
               <w:fldChar w:fldCharType="end"/>
             </w:r>
           </w:hyperlink>
@@ -1297,10 +1811,40 @@
                 <w:noProof/>
               </w:rPr>
               <w:tab/>
+            </w:r>
+            <w:r>
+              <w:rPr>
+                <w:noProof/>
+              </w:rPr>
               <w:fldChar w:fldCharType="begin"/>
+            </w:r>
+            <w:r>
+              <w:rPr>
+                <w:noProof/>
+              </w:rPr>
               <w:instrText xml:space="preserve"> PAGEREF _Toc238057029 \h </w:instrText>
+            </w:r>
+            <w:r>
+              <w:rPr>
+                <w:noProof/>
+              </w:rPr>
+            </w:r>
+            <w:r>
+              <w:rPr>
+                <w:noProof/>
+              </w:rPr>
               <w:fldChar w:fldCharType="separate"/>
+            </w:r>
+            <w:r>
+              <w:rPr>
+                <w:noProof/>
+              </w:rPr>
               <w:t>1</w:t>
+            </w:r>
+            <w:r>
+              <w:rPr>
+                <w:noProof/>
+              </w:rPr>
               <w:fldChar w:fldCharType="end"/>
             </w:r>
           </w:hyperlink>
@@ -1328,10 +1872,40 @@
                 <w:noProof/>
               </w:rPr>
               <w:tab/>
+            </w:r>
+            <w:r>
+              <w:rPr>
+                <w:noProof/>
+              </w:rPr>
               <w:fldChar w:fldCharType="begin"/>
+            </w:r>
+            <w:r>
+              <w:rPr>
+                <w:noProof/>
+              </w:rPr>
               <w:instrText xml:space="preserve"> PAGEREF _Toc238057030 \h </w:instrText>
+            </w:r>
+            <w:r>
+              <w:rPr>
+                <w:noProof/>
+              </w:rPr>
+            </w:r>
+            <w:r>
+              <w:rPr>
+                <w:noProof/>
+              </w:rPr>
               <w:fldChar w:fldCharType="separate"/>
+            </w:r>
+            <w:r>
+              <w:rPr>
+                <w:noProof/>
+              </w:rPr>
               <w:t>1</w:t>
+            </w:r>
+            <w:r>
+              <w:rPr>
+                <w:noProof/>
+              </w:rPr>
               <w:fldChar w:fldCharType="end"/>
             </w:r>
           </w:hyperlink>
@@ -1359,10 +1933,40 @@
                 <w:noProof/>
               </w:rPr>
               <w:tab/>
+            </w:r>
+            <w:r>
+              <w:rPr>
+                <w:noProof/>
+              </w:rPr>
               <w:fldChar w:fldCharType="begin"/>
+            </w:r>
+            <w:r>
+              <w:rPr>
+                <w:noProof/>
+              </w:rPr>
               <w:instrText xml:space="preserve"> PAGEREF _Toc238057031 \h </w:instrText>
+            </w:r>
+            <w:r>
+              <w:rPr>
+                <w:noProof/>
+              </w:rPr>
+            </w:r>
+            <w:r>
+              <w:rPr>
+                <w:noProof/>
+              </w:rPr>
               <w:fldChar w:fldCharType="separate"/>
+            </w:r>
+            <w:r>
+              <w:rPr>
+                <w:noProof/>
+              </w:rPr>
               <w:t>1</w:t>
+            </w:r>
+            <w:r>
+              <w:rPr>
+                <w:noProof/>
+              </w:rPr>
               <w:fldChar w:fldCharType="end"/>
             </w:r>
           </w:hyperlink>
@@ -1390,10 +1994,40 @@
                 <w:noProof/>
               </w:rPr>
               <w:tab/>
+            </w:r>
+            <w:r>
+              <w:rPr>
+                <w:noProof/>
+              </w:rPr>
               <w:fldChar w:fldCharType="begin"/>
+            </w:r>
+            <w:r>
+              <w:rPr>
+                <w:noProof/>
+              </w:rPr>
               <w:instrText xml:space="preserve"> PAGEREF _Toc238057032 \h </w:instrText>
+            </w:r>
+            <w:r>
+              <w:rPr>
+                <w:noProof/>
+              </w:rPr>
+            </w:r>
+            <w:r>
+              <w:rPr>
+                <w:noProof/>
+              </w:rPr>
               <w:fldChar w:fldCharType="separate"/>
+            </w:r>
+            <w:r>
+              <w:rPr>
+                <w:noProof/>
+              </w:rPr>
               <w:t>1</w:t>
+            </w:r>
+            <w:r>
+              <w:rPr>
+                <w:noProof/>
+              </w:rPr>
               <w:fldChar w:fldCharType="end"/>
             </w:r>
           </w:hyperlink>
@@ -1421,10 +2055,40 @@
                 <w:noProof/>
               </w:rPr>
               <w:tab/>
+            </w:r>
+            <w:r>
+              <w:rPr>
+                <w:noProof/>
+              </w:rPr>
               <w:fldChar w:fldCharType="begin"/>
+            </w:r>
+            <w:r>
+              <w:rPr>
+                <w:noProof/>
+              </w:rPr>
               <w:instrText xml:space="preserve"> PAGEREF _Toc238057033 \h </w:instrText>
+            </w:r>
+            <w:r>
+              <w:rPr>
+                <w:noProof/>
+              </w:rPr>
+            </w:r>
+            <w:r>
+              <w:rPr>
+                <w:noProof/>
+              </w:rPr>
               <w:fldChar w:fldCharType="separate"/>
+            </w:r>
+            <w:r>
+              <w:rPr>
+                <w:noProof/>
+              </w:rPr>
               <w:t>1</w:t>
+            </w:r>
+            <w:r>
+              <w:rPr>
+                <w:noProof/>
+              </w:rPr>
               <w:fldChar w:fldCharType="end"/>
             </w:r>
           </w:hyperlink>
@@ -1452,10 +2116,40 @@
                 <w:noProof/>
               </w:rPr>
               <w:tab/>
+            </w:r>
+            <w:r>
+              <w:rPr>
+                <w:noProof/>
+              </w:rPr>
               <w:fldChar w:fldCharType="begin"/>
+            </w:r>
+            <w:r>
+              <w:rPr>
+                <w:noProof/>
+              </w:rPr>
               <w:instrText xml:space="preserve"> PAGEREF _Toc238057034 \h </w:instrText>
+            </w:r>
+            <w:r>
+              <w:rPr>
+                <w:noProof/>
+              </w:rPr>
+            </w:r>
+            <w:r>
+              <w:rPr>
+                <w:noProof/>
+              </w:rPr>
               <w:fldChar w:fldCharType="separate"/>
+            </w:r>
+            <w:r>
+              <w:rPr>
+                <w:noProof/>
+              </w:rPr>
               <w:t>1</w:t>
+            </w:r>
+            <w:r>
+              <w:rPr>
+                <w:noProof/>
+              </w:rPr>
               <w:fldChar w:fldCharType="end"/>
             </w:r>
           </w:hyperlink>
@@ -1483,10 +2177,40 @@
                 <w:noProof/>
               </w:rPr>
               <w:tab/>
+            </w:r>
+            <w:r>
+              <w:rPr>
+                <w:noProof/>
+              </w:rPr>
               <w:fldChar w:fldCharType="begin"/>
+            </w:r>
+            <w:r>
+              <w:rPr>
+                <w:noProof/>
+              </w:rPr>
               <w:instrText xml:space="preserve"> PAGEREF _Toc238057035 \h </w:instrText>
+            </w:r>
+            <w:r>
+              <w:rPr>
+                <w:noProof/>
+              </w:rPr>
+            </w:r>
+            <w:r>
+              <w:rPr>
+                <w:noProof/>
+              </w:rPr>
               <w:fldChar w:fldCharType="separate"/>
+            </w:r>
+            <w:r>
+              <w:rPr>
+                <w:noProof/>
+              </w:rPr>
               <w:t>1</w:t>
+            </w:r>
+            <w:r>
+              <w:rPr>
+                <w:noProof/>
+              </w:rPr>
               <w:fldChar w:fldCharType="end"/>
             </w:r>
           </w:hyperlink>
@@ -1514,10 +2238,40 @@
                 <w:noProof/>
               </w:rPr>
               <w:tab/>
+            </w:r>
+            <w:r>
+              <w:rPr>
+                <w:noProof/>
+              </w:rPr>
               <w:fldChar w:fldCharType="begin"/>
+            </w:r>
+            <w:r>
+              <w:rPr>
+                <w:noProof/>
+              </w:rPr>
               <w:instrText xml:space="preserve"> PAGEREF _Toc238057036 \h </w:instrText>
+            </w:r>
+            <w:r>
+              <w:rPr>
+                <w:noProof/>
+              </w:rPr>
+            </w:r>
+            <w:r>
+              <w:rPr>
+                <w:noProof/>
+              </w:rPr>
               <w:fldChar w:fldCharType="separate"/>
+            </w:r>
+            <w:r>
+              <w:rPr>
+                <w:noProof/>
+              </w:rPr>
               <w:t>1</w:t>
+            </w:r>
+            <w:r>
+              <w:rPr>
+                <w:noProof/>
+              </w:rPr>
               <w:fldChar w:fldCharType="end"/>
             </w:r>
           </w:hyperlink>
@@ -1545,10 +2299,40 @@
                 <w:noProof/>
               </w:rPr>
               <w:tab/>
+            </w:r>
+            <w:r>
+              <w:rPr>
+                <w:noProof/>
+              </w:rPr>
               <w:fldChar w:fldCharType="begin"/>
+            </w:r>
+            <w:r>
+              <w:rPr>
+                <w:noProof/>
+              </w:rPr>
               <w:instrText xml:space="preserve"> PAGEREF _Toc238057037 \h </w:instrText>
+            </w:r>
+            <w:r>
+              <w:rPr>
+                <w:noProof/>
+              </w:rPr>
+            </w:r>
+            <w:r>
+              <w:rPr>
+                <w:noProof/>
+              </w:rPr>
               <w:fldChar w:fldCharType="separate"/>
+            </w:r>
+            <w:r>
+              <w:rPr>
+                <w:noProof/>
+              </w:rPr>
               <w:t>1</w:t>
+            </w:r>
+            <w:r>
+              <w:rPr>
+                <w:noProof/>
+              </w:rPr>
               <w:fldChar w:fldCharType="end"/>
             </w:r>
           </w:hyperlink>
@@ -1576,10 +2360,40 @@
                 <w:noProof/>
               </w:rPr>
               <w:tab/>
+            </w:r>
+            <w:r>
+              <w:rPr>
+                <w:noProof/>
+              </w:rPr>
               <w:fldChar w:fldCharType="begin"/>
+            </w:r>
+            <w:r>
+              <w:rPr>
+                <w:noProof/>
+              </w:rPr>
               <w:instrText xml:space="preserve"> PAGEREF _Toc238057038 \h </w:instrText>
+            </w:r>
+            <w:r>
+              <w:rPr>
+                <w:noProof/>
+              </w:rPr>
+            </w:r>
+            <w:r>
+              <w:rPr>
+                <w:noProof/>
+              </w:rPr>
               <w:fldChar w:fldCharType="separate"/>
+            </w:r>
+            <w:r>
+              <w:rPr>
+                <w:noProof/>
+              </w:rPr>
               <w:t>1</w:t>
+            </w:r>
+            <w:r>
+              <w:rPr>
+                <w:noProof/>
+              </w:rPr>
               <w:fldChar w:fldCharType="end"/>
             </w:r>
           </w:hyperlink>
@@ -1607,10 +2421,40 @@
                 <w:noProof/>
               </w:rPr>
               <w:tab/>
+            </w:r>
+            <w:r>
+              <w:rPr>
+                <w:noProof/>
+              </w:rPr>
               <w:fldChar w:fldCharType="begin"/>
+            </w:r>
+            <w:r>
+              <w:rPr>
+                <w:noProof/>
+              </w:rPr>
               <w:instrText xml:space="preserve"> PAGEREF _Toc238057039 \h </w:instrText>
+            </w:r>
+            <w:r>
+              <w:rPr>
+                <w:noProof/>
+              </w:rPr>
+            </w:r>
+            <w:r>
+              <w:rPr>
+                <w:noProof/>
+              </w:rPr>
               <w:fldChar w:fldCharType="separate"/>
+            </w:r>
+            <w:r>
+              <w:rPr>
+                <w:noProof/>
+              </w:rPr>
               <w:t>1</w:t>
+            </w:r>
+            <w:r>
+              <w:rPr>
+                <w:noProof/>
+              </w:rPr>
               <w:fldChar w:fldCharType="end"/>
             </w:r>
           </w:hyperlink>
@@ -1638,10 +2482,40 @@
                 <w:noProof/>
               </w:rPr>
               <w:tab/>
+            </w:r>
+            <w:r>
+              <w:rPr>
+                <w:noProof/>
+              </w:rPr>
               <w:fldChar w:fldCharType="begin"/>
+            </w:r>
+            <w:r>
+              <w:rPr>
+                <w:noProof/>
+              </w:rPr>
               <w:instrText xml:space="preserve"> PAGEREF _Toc238057040 \h </w:instrText>
+            </w:r>
+            <w:r>
+              <w:rPr>
+                <w:noProof/>
+              </w:rPr>
+            </w:r>
+            <w:r>
+              <w:rPr>
+                <w:noProof/>
+              </w:rPr>
               <w:fldChar w:fldCharType="separate"/>
+            </w:r>
+            <w:r>
+              <w:rPr>
+                <w:noProof/>
+              </w:rPr>
               <w:t>1</w:t>
+            </w:r>
+            <w:r>
+              <w:rPr>
+                <w:noProof/>
+              </w:rPr>
               <w:fldChar w:fldCharType="end"/>
             </w:r>
           </w:hyperlink>
@@ -1669,10 +2543,40 @@
                 <w:noProof/>
               </w:rPr>
               <w:tab/>
+            </w:r>
+            <w:r>
+              <w:rPr>
+                <w:noProof/>
+              </w:rPr>
               <w:fldChar w:fldCharType="begin"/>
+            </w:r>
+            <w:r>
+              <w:rPr>
+                <w:noProof/>
+              </w:rPr>
               <w:instrText xml:space="preserve"> PAGEREF _Toc238057041 \h </w:instrText>
+            </w:r>
+            <w:r>
+              <w:rPr>
+                <w:noProof/>
+              </w:rPr>
+            </w:r>
+            <w:r>
+              <w:rPr>
+                <w:noProof/>
+              </w:rPr>
               <w:fldChar w:fldCharType="separate"/>
+            </w:r>
+            <w:r>
+              <w:rPr>
+                <w:noProof/>
+              </w:rPr>
               <w:t>1</w:t>
+            </w:r>
+            <w:r>
+              <w:rPr>
+                <w:noProof/>
+              </w:rPr>
               <w:fldChar w:fldCharType="end"/>
             </w:r>
           </w:hyperlink>
@@ -1700,10 +2604,40 @@
                 <w:noProof/>
               </w:rPr>
               <w:tab/>
+            </w:r>
+            <w:r>
+              <w:rPr>
+                <w:noProof/>
+              </w:rPr>
               <w:fldChar w:fldCharType="begin"/>
+            </w:r>
+            <w:r>
+              <w:rPr>
+                <w:noProof/>
+              </w:rPr>
               <w:instrText xml:space="preserve"> PAGEREF _Toc238057042 \h </w:instrText>
+            </w:r>
+            <w:r>
+              <w:rPr>
+                <w:noProof/>
+              </w:rPr>
+            </w:r>
+            <w:r>
+              <w:rPr>
+                <w:noProof/>
+              </w:rPr>
               <w:fldChar w:fldCharType="separate"/>
+            </w:r>
+            <w:r>
+              <w:rPr>
+                <w:noProof/>
+              </w:rPr>
               <w:t>1</w:t>
+            </w:r>
+            <w:r>
+              <w:rPr>
+                <w:noProof/>
+              </w:rPr>
               <w:fldChar w:fldCharType="end"/>
             </w:r>
           </w:hyperlink>
@@ -1731,10 +2665,40 @@
                 <w:noProof/>
               </w:rPr>
               <w:tab/>
+            </w:r>
+            <w:r>
+              <w:rPr>
+                <w:noProof/>
+              </w:rPr>
               <w:fldChar w:fldCharType="begin"/>
+            </w:r>
+            <w:r>
+              <w:rPr>
+                <w:noProof/>
+              </w:rPr>
               <w:instrText xml:space="preserve"> PAGEREF _Toc238057043 \h </w:instrText>
+            </w:r>
+            <w:r>
+              <w:rPr>
+                <w:noProof/>
+              </w:rPr>
+            </w:r>
+            <w:r>
+              <w:rPr>
+                <w:noProof/>
+              </w:rPr>
               <w:fldChar w:fldCharType="separate"/>
+            </w:r>
+            <w:r>
+              <w:rPr>
+                <w:noProof/>
+              </w:rPr>
               <w:t>1</w:t>
+            </w:r>
+            <w:r>
+              <w:rPr>
+                <w:noProof/>
+              </w:rPr>
               <w:fldChar w:fldCharType="end"/>
             </w:r>
           </w:hyperlink>
@@ -1762,10 +2726,40 @@
                 <w:noProof/>
               </w:rPr>
               <w:tab/>
+            </w:r>
+            <w:r>
+              <w:rPr>
+                <w:noProof/>
+              </w:rPr>
               <w:fldChar w:fldCharType="begin"/>
+            </w:r>
+            <w:r>
+              <w:rPr>
+                <w:noProof/>
+              </w:rPr>
               <w:instrText xml:space="preserve"> PAGEREF _Toc238057044 \h </w:instrText>
+            </w:r>
+            <w:r>
+              <w:rPr>
+                <w:noProof/>
+              </w:rPr>
+            </w:r>
+            <w:r>
+              <w:rPr>
+                <w:noProof/>
+              </w:rPr>
               <w:fldChar w:fldCharType="separate"/>
+            </w:r>
+            <w:r>
+              <w:rPr>
+                <w:noProof/>
+              </w:rPr>
               <w:t>1</w:t>
+            </w:r>
+            <w:r>
+              <w:rPr>
+                <w:noProof/>
+              </w:rPr>
               <w:fldChar w:fldCharType="end"/>
             </w:r>
           </w:hyperlink>
@@ -1793,10 +2787,40 @@
                 <w:noProof/>
               </w:rPr>
               <w:tab/>
+            </w:r>
+            <w:r>
+              <w:rPr>
+                <w:noProof/>
+              </w:rPr>
               <w:fldChar w:fldCharType="begin"/>
+            </w:r>
+            <w:r>
+              <w:rPr>
+                <w:noProof/>
+              </w:rPr>
               <w:instrText xml:space="preserve"> PAGEREF _Toc238057045 \h </w:instrText>
+            </w:r>
+            <w:r>
+              <w:rPr>
+                <w:noProof/>
+              </w:rPr>
+            </w:r>
+            <w:r>
+              <w:rPr>
+                <w:noProof/>
+              </w:rPr>
               <w:fldChar w:fldCharType="separate"/>
+            </w:r>
+            <w:r>
+              <w:rPr>
+                <w:noProof/>
+              </w:rPr>
               <w:t>1</w:t>
+            </w:r>
+            <w:r>
+              <w:rPr>
+                <w:noProof/>
+              </w:rPr>
               <w:fldChar w:fldCharType="end"/>
             </w:r>
           </w:hyperlink>
@@ -1824,10 +2848,40 @@
                 <w:noProof/>
               </w:rPr>
               <w:tab/>
+            </w:r>
+            <w:r>
+              <w:rPr>
+                <w:noProof/>
+              </w:rPr>
               <w:fldChar w:fldCharType="begin"/>
+            </w:r>
+            <w:r>
+              <w:rPr>
+                <w:noProof/>
+              </w:rPr>
               <w:instrText xml:space="preserve"> PAGEREF _Toc238057046 \h </w:instrText>
+            </w:r>
+            <w:r>
+              <w:rPr>
+                <w:noProof/>
+              </w:rPr>
+            </w:r>
+            <w:r>
+              <w:rPr>
+                <w:noProof/>
+              </w:rPr>
               <w:fldChar w:fldCharType="separate"/>
+            </w:r>
+            <w:r>
+              <w:rPr>
+                <w:noProof/>
+              </w:rPr>
               <w:t>1</w:t>
+            </w:r>
+            <w:r>
+              <w:rPr>
+                <w:noProof/>
+              </w:rPr>
               <w:fldChar w:fldCharType="end"/>
             </w:r>
           </w:hyperlink>
@@ -1855,10 +2909,40 @@
                 <w:noProof/>
               </w:rPr>
               <w:tab/>
+            </w:r>
+            <w:r>
+              <w:rPr>
+                <w:noProof/>
+              </w:rPr>
               <w:fldChar w:fldCharType="begin"/>
+            </w:r>
+            <w:r>
+              <w:rPr>
+                <w:noProof/>
+              </w:rPr>
               <w:instrText xml:space="preserve"> PAGEREF _Toc238057047 \h </w:instrText>
+            </w:r>
+            <w:r>
+              <w:rPr>
+                <w:noProof/>
+              </w:rPr>
+            </w:r>
+            <w:r>
+              <w:rPr>
+                <w:noProof/>
+              </w:rPr>
               <w:fldChar w:fldCharType="separate"/>
+            </w:r>
+            <w:r>
+              <w:rPr>
+                <w:noProof/>
+              </w:rPr>
               <w:t>1</w:t>
+            </w:r>
+            <w:r>
+              <w:rPr>
+                <w:noProof/>
+              </w:rPr>
               <w:fldChar w:fldCharType="end"/>
             </w:r>
           </w:hyperlink>
@@ -1886,10 +2970,40 @@
                 <w:noProof/>
               </w:rPr>
               <w:tab/>
+            </w:r>
+            <w:r>
+              <w:rPr>
+                <w:noProof/>
+              </w:rPr>
               <w:fldChar w:fldCharType="begin"/>
+            </w:r>
+            <w:r>
+              <w:rPr>
+                <w:noProof/>
+              </w:rPr>
               <w:instrText xml:space="preserve"> PAGEREF _Toc238057048 \h </w:instrText>
+            </w:r>
+            <w:r>
+              <w:rPr>
+                <w:noProof/>
+              </w:rPr>
+            </w:r>
+            <w:r>
+              <w:rPr>
+                <w:noProof/>
+              </w:rPr>
               <w:fldChar w:fldCharType="separate"/>
+            </w:r>
+            <w:r>
+              <w:rPr>
+                <w:noProof/>
+              </w:rPr>
               <w:t>1</w:t>
+            </w:r>
+            <w:r>
+              <w:rPr>
+                <w:noProof/>
+              </w:rPr>
               <w:fldChar w:fldCharType="end"/>
             </w:r>
           </w:hyperlink>
@@ -1917,10 +3031,40 @@
                 <w:noProof/>
               </w:rPr>
               <w:tab/>
+            </w:r>
+            <w:r>
+              <w:rPr>
+                <w:noProof/>
+              </w:rPr>
               <w:fldChar w:fldCharType="begin"/>
+            </w:r>
+            <w:r>
+              <w:rPr>
+                <w:noProof/>
+              </w:rPr>
               <w:instrText xml:space="preserve"> PAGEREF _Toc238057049 \h </w:instrText>
+            </w:r>
+            <w:r>
+              <w:rPr>
+                <w:noProof/>
+              </w:rPr>
+            </w:r>
+            <w:r>
+              <w:rPr>
+                <w:noProof/>
+              </w:rPr>
               <w:fldChar w:fldCharType="separate"/>
+            </w:r>
+            <w:r>
+              <w:rPr>
+                <w:noProof/>
+              </w:rPr>
               <w:t>1</w:t>
+            </w:r>
+            <w:r>
+              <w:rPr>
+                <w:noProof/>
+              </w:rPr>
               <w:fldChar w:fldCharType="end"/>
             </w:r>
           </w:hyperlink>
@@ -1948,10 +3092,40 @@
                 <w:noProof/>
               </w:rPr>
               <w:tab/>
+            </w:r>
+            <w:r>
+              <w:rPr>
+                <w:noProof/>
+              </w:rPr>
               <w:fldChar w:fldCharType="begin"/>
+            </w:r>
+            <w:r>
+              <w:rPr>
+                <w:noProof/>
+              </w:rPr>
               <w:instrText xml:space="preserve"> PAGEREF _Toc238057050 \h </w:instrText>
+            </w:r>
+            <w:r>
+              <w:rPr>
+                <w:noProof/>
+              </w:rPr>
+            </w:r>
+            <w:r>
+              <w:rPr>
+                <w:noProof/>
+              </w:rPr>
               <w:fldChar w:fldCharType="separate"/>
+            </w:r>
+            <w:r>
+              <w:rPr>
+                <w:noProof/>
+              </w:rPr>
               <w:t>1</w:t>
+            </w:r>
+            <w:r>
+              <w:rPr>
+                <w:noProof/>
+              </w:rPr>
               <w:fldChar w:fldCharType="end"/>
             </w:r>
           </w:hyperlink>
@@ -1979,10 +3153,40 @@
                 <w:noProof/>
               </w:rPr>
               <w:tab/>
+            </w:r>
+            <w:r>
+              <w:rPr>
+                <w:noProof/>
+              </w:rPr>
               <w:fldChar w:fldCharType="begin"/>
+            </w:r>
+            <w:r>
+              <w:rPr>
+                <w:noProof/>
+              </w:rPr>
               <w:instrText xml:space="preserve"> PAGEREF _Toc238057051 \h </w:instrText>
+            </w:r>
+            <w:r>
+              <w:rPr>
+                <w:noProof/>
+              </w:rPr>
+            </w:r>
+            <w:r>
+              <w:rPr>
+                <w:noProof/>
+              </w:rPr>
               <w:fldChar w:fldCharType="separate"/>
+            </w:r>
+            <w:r>
+              <w:rPr>
+                <w:noProof/>
+              </w:rPr>
               <w:t>1</w:t>
+            </w:r>
+            <w:r>
+              <w:rPr>
+                <w:noProof/>
+              </w:rPr>
               <w:fldChar w:fldCharType="end"/>
             </w:r>
           </w:hyperlink>
@@ -2010,10 +3214,40 @@
                 <w:noProof/>
               </w:rPr>
               <w:tab/>
+            </w:r>
+            <w:r>
+              <w:rPr>
+                <w:noProof/>
+              </w:rPr>
               <w:fldChar w:fldCharType="begin"/>
+            </w:r>
+            <w:r>
+              <w:rPr>
+                <w:noProof/>
+              </w:rPr>
               <w:instrText xml:space="preserve"> PAGEREF _Toc238057052 \h </w:instrText>
+            </w:r>
+            <w:r>
+              <w:rPr>
+                <w:noProof/>
+              </w:rPr>
+            </w:r>
+            <w:r>
+              <w:rPr>
+                <w:noProof/>
+              </w:rPr>
               <w:fldChar w:fldCharType="separate"/>
+            </w:r>
+            <w:r>
+              <w:rPr>
+                <w:noProof/>
+              </w:rPr>
               <w:t>1</w:t>
+            </w:r>
+            <w:r>
+              <w:rPr>
+                <w:noProof/>
+              </w:rPr>
               <w:fldChar w:fldCharType="end"/>
             </w:r>
           </w:hyperlink>
@@ -2041,10 +3275,40 @@
                 <w:noProof/>
               </w:rPr>
               <w:tab/>
+            </w:r>
+            <w:r>
+              <w:rPr>
+                <w:noProof/>
+              </w:rPr>
               <w:fldChar w:fldCharType="begin"/>
+            </w:r>
+            <w:r>
+              <w:rPr>
+                <w:noProof/>
+              </w:rPr>
               <w:instrText xml:space="preserve"> PAGEREF _Toc238057053 \h </w:instrText>
+            </w:r>
+            <w:r>
+              <w:rPr>
+                <w:noProof/>
+              </w:rPr>
+            </w:r>
+            <w:r>
+              <w:rPr>
+                <w:noProof/>
+              </w:rPr>
               <w:fldChar w:fldCharType="separate"/>
+            </w:r>
+            <w:r>
+              <w:rPr>
+                <w:noProof/>
+              </w:rPr>
               <w:t>1</w:t>
+            </w:r>
+            <w:r>
+              <w:rPr>
+                <w:noProof/>
+              </w:rPr>
               <w:fldChar w:fldCharType="end"/>
             </w:r>
           </w:hyperlink>
@@ -2072,10 +3336,40 @@
                 <w:noProof/>
               </w:rPr>
               <w:tab/>
+            </w:r>
+            <w:r>
+              <w:rPr>
+                <w:noProof/>
+              </w:rPr>
               <w:fldChar w:fldCharType="begin"/>
+            </w:r>
+            <w:r>
+              <w:rPr>
+                <w:noProof/>
+              </w:rPr>
               <w:instrText xml:space="preserve"> PAGEREF _Toc238057054 \h </w:instrText>
+            </w:r>
+            <w:r>
+              <w:rPr>
+                <w:noProof/>
+              </w:rPr>
+            </w:r>
+            <w:r>
+              <w:rPr>
+                <w:noProof/>
+              </w:rPr>
               <w:fldChar w:fldCharType="separate"/>
+            </w:r>
+            <w:r>
+              <w:rPr>
+                <w:noProof/>
+              </w:rPr>
               <w:t>1</w:t>
+            </w:r>
+            <w:r>
+              <w:rPr>
+                <w:noProof/>
+              </w:rPr>
               <w:fldChar w:fldCharType="end"/>
             </w:r>
           </w:hyperlink>
@@ -2103,10 +3397,40 @@
                 <w:noProof/>
               </w:rPr>
               <w:tab/>
+            </w:r>
+            <w:r>
+              <w:rPr>
+                <w:noProof/>
+              </w:rPr>
               <w:fldChar w:fldCharType="begin"/>
+            </w:r>
+            <w:r>
+              <w:rPr>
+                <w:noProof/>
+              </w:rPr>
               <w:instrText xml:space="preserve"> PAGEREF _Toc238057055 \h </w:instrText>
+            </w:r>
+            <w:r>
+              <w:rPr>
+                <w:noProof/>
+              </w:rPr>
+            </w:r>
+            <w:r>
+              <w:rPr>
+                <w:noProof/>
+              </w:rPr>
               <w:fldChar w:fldCharType="separate"/>
+            </w:r>
+            <w:r>
+              <w:rPr>
+                <w:noProof/>
+              </w:rPr>
               <w:t>1</w:t>
+            </w:r>
+            <w:r>
+              <w:rPr>
+                <w:noProof/>
+              </w:rPr>
               <w:fldChar w:fldCharType="end"/>
             </w:r>
           </w:hyperlink>
@@ -2134,10 +3458,40 @@
                 <w:noProof/>
               </w:rPr>
               <w:tab/>
+            </w:r>
+            <w:r>
+              <w:rPr>
+                <w:noProof/>
+              </w:rPr>
               <w:fldChar w:fldCharType="begin"/>
+            </w:r>
+            <w:r>
+              <w:rPr>
+                <w:noProof/>
+              </w:rPr>
               <w:instrText xml:space="preserve"> PAGEREF _Toc238057056 \h </w:instrText>
+            </w:r>
+            <w:r>
+              <w:rPr>
+                <w:noProof/>
+              </w:rPr>
+            </w:r>
+            <w:r>
+              <w:rPr>
+                <w:noProof/>
+              </w:rPr>
               <w:fldChar w:fldCharType="separate"/>
+            </w:r>
+            <w:r>
+              <w:rPr>
+                <w:noProof/>
+              </w:rPr>
               <w:t>1</w:t>
+            </w:r>
+            <w:r>
+              <w:rPr>
+                <w:noProof/>
+              </w:rPr>
               <w:fldChar w:fldCharType="end"/>
             </w:r>
           </w:hyperlink>
@@ -2165,10 +3519,40 @@
                 <w:noProof/>
               </w:rPr>
               <w:tab/>
+            </w:r>
+            <w:r>
+              <w:rPr>
+                <w:noProof/>
+              </w:rPr>
               <w:fldChar w:fldCharType="begin"/>
+            </w:r>
+            <w:r>
+              <w:rPr>
+                <w:noProof/>
+              </w:rPr>
               <w:instrText xml:space="preserve"> PAGEREF _Toc238057057 \h </w:instrText>
+            </w:r>
+            <w:r>
+              <w:rPr>
+                <w:noProof/>
+              </w:rPr>
+            </w:r>
+            <w:r>
+              <w:rPr>
+                <w:noProof/>
+              </w:rPr>
               <w:fldChar w:fldCharType="separate"/>
+            </w:r>
+            <w:r>
+              <w:rPr>
+                <w:noProof/>
+              </w:rPr>
               <w:t>1</w:t>
+            </w:r>
+            <w:r>
+              <w:rPr>
+                <w:noProof/>
+              </w:rPr>
               <w:fldChar w:fldCharType="end"/>
             </w:r>
           </w:hyperlink>
@@ -2196,10 +3580,40 @@
                 <w:noProof/>
               </w:rPr>
               <w:tab/>
+            </w:r>
+            <w:r>
+              <w:rPr>
+                <w:noProof/>
+              </w:rPr>
               <w:fldChar w:fldCharType="begin"/>
+            </w:r>
+            <w:r>
+              <w:rPr>
+                <w:noProof/>
+              </w:rPr>
               <w:instrText xml:space="preserve"> PAGEREF _Toc238057058 \h </w:instrText>
+            </w:r>
+            <w:r>
+              <w:rPr>
+                <w:noProof/>
+              </w:rPr>
+            </w:r>
+            <w:r>
+              <w:rPr>
+                <w:noProof/>
+              </w:rPr>
               <w:fldChar w:fldCharType="separate"/>
+            </w:r>
+            <w:r>
+              <w:rPr>
+                <w:noProof/>
+              </w:rPr>
               <w:t>1</w:t>
+            </w:r>
+            <w:r>
+              <w:rPr>
+                <w:noProof/>
+              </w:rPr>
               <w:fldChar w:fldCharType="end"/>
             </w:r>
           </w:hyperlink>
@@ -2227,10 +3641,40 @@
                 <w:noProof/>
               </w:rPr>
               <w:tab/>
+            </w:r>
+            <w:r>
+              <w:rPr>
+                <w:noProof/>
+              </w:rPr>
               <w:fldChar w:fldCharType="begin"/>
+            </w:r>
+            <w:r>
+              <w:rPr>
+                <w:noProof/>
+              </w:rPr>
               <w:instrText xml:space="preserve"> PAGEREF _Toc238057059 \h </w:instrText>
+            </w:r>
+            <w:r>
+              <w:rPr>
+                <w:noProof/>
+              </w:rPr>
+            </w:r>
+            <w:r>
+              <w:rPr>
+                <w:noProof/>
+              </w:rPr>
               <w:fldChar w:fldCharType="separate"/>
+            </w:r>
+            <w:r>
+              <w:rPr>
+                <w:noProof/>
+              </w:rPr>
               <w:t>1</w:t>
+            </w:r>
+            <w:r>
+              <w:rPr>
+                <w:noProof/>
+              </w:rPr>
               <w:fldChar w:fldCharType="end"/>
             </w:r>
           </w:hyperlink>
@@ -2258,10 +3702,40 @@
                 <w:noProof/>
               </w:rPr>
               <w:tab/>
+            </w:r>
+            <w:r>
+              <w:rPr>
+                <w:noProof/>
+              </w:rPr>
               <w:fldChar w:fldCharType="begin"/>
+            </w:r>
+            <w:r>
+              <w:rPr>
+                <w:noProof/>
+              </w:rPr>
               <w:instrText xml:space="preserve"> PAGEREF _Toc238057060 \h </w:instrText>
+            </w:r>
+            <w:r>
+              <w:rPr>
+                <w:noProof/>
+              </w:rPr>
+            </w:r>
+            <w:r>
+              <w:rPr>
+                <w:noProof/>
+              </w:rPr>
               <w:fldChar w:fldCharType="separate"/>
+            </w:r>
+            <w:r>
+              <w:rPr>
+                <w:noProof/>
+              </w:rPr>
               <w:t>1</w:t>
+            </w:r>
+            <w:r>
+              <w:rPr>
+                <w:noProof/>
+              </w:rPr>
               <w:fldChar w:fldCharType="end"/>
             </w:r>
           </w:hyperlink>
@@ -2289,10 +3763,40 @@
                 <w:noProof/>
               </w:rPr>
               <w:tab/>
+            </w:r>
+            <w:r>
+              <w:rPr>
+                <w:noProof/>
+              </w:rPr>
               <w:fldChar w:fldCharType="begin"/>
+            </w:r>
+            <w:r>
+              <w:rPr>
+                <w:noProof/>
+              </w:rPr>
               <w:instrText xml:space="preserve"> PAGEREF _Toc238057061 \h </w:instrText>
+            </w:r>
+            <w:r>
+              <w:rPr>
+                <w:noProof/>
+              </w:rPr>
+            </w:r>
+            <w:r>
+              <w:rPr>
+                <w:noProof/>
+              </w:rPr>
               <w:fldChar w:fldCharType="separate"/>
+            </w:r>
+            <w:r>
+              <w:rPr>
+                <w:noProof/>
+              </w:rPr>
               <w:t>1</w:t>
+            </w:r>
+            <w:r>
+              <w:rPr>
+                <w:noProof/>
+              </w:rPr>
               <w:fldChar w:fldCharType="end"/>
             </w:r>
           </w:hyperlink>
@@ -2320,10 +3824,40 @@
                 <w:noProof/>
               </w:rPr>
               <w:tab/>
+            </w:r>
+            <w:r>
+              <w:rPr>
+                <w:noProof/>
+              </w:rPr>
               <w:fldChar w:fldCharType="begin"/>
+            </w:r>
+            <w:r>
+              <w:rPr>
+                <w:noProof/>
+              </w:rPr>
               <w:instrText xml:space="preserve"> PAGEREF _Toc238057062 \h </w:instrText>
+            </w:r>
+            <w:r>
+              <w:rPr>
+                <w:noProof/>
+              </w:rPr>
+            </w:r>
+            <w:r>
+              <w:rPr>
+                <w:noProof/>
+              </w:rPr>
               <w:fldChar w:fldCharType="separate"/>
+            </w:r>
+            <w:r>
+              <w:rPr>
+                <w:noProof/>
+              </w:rPr>
               <w:t>1</w:t>
+            </w:r>
+            <w:r>
+              <w:rPr>
+                <w:noProof/>
+              </w:rPr>
               <w:fldChar w:fldCharType="end"/>
             </w:r>
           </w:hyperlink>
@@ -2351,10 +3885,40 @@
                 <w:noProof/>
               </w:rPr>
               <w:tab/>
+            </w:r>
+            <w:r>
+              <w:rPr>
+                <w:noProof/>
+              </w:rPr>
               <w:fldChar w:fldCharType="begin"/>
+            </w:r>
+            <w:r>
+              <w:rPr>
+                <w:noProof/>
+              </w:rPr>
               <w:instrText xml:space="preserve"> PAGEREF _Toc238057063 \h </w:instrText>
+            </w:r>
+            <w:r>
+              <w:rPr>
+                <w:noProof/>
+              </w:rPr>
+            </w:r>
+            <w:r>
+              <w:rPr>
+                <w:noProof/>
+              </w:rPr>
               <w:fldChar w:fldCharType="separate"/>
+            </w:r>
+            <w:r>
+              <w:rPr>
+                <w:noProof/>
+              </w:rPr>
               <w:t>1</w:t>
+            </w:r>
+            <w:r>
+              <w:rPr>
+                <w:noProof/>
+              </w:rPr>
               <w:fldChar w:fldCharType="end"/>
             </w:r>
           </w:hyperlink>
@@ -2382,10 +3946,40 @@
                 <w:noProof/>
               </w:rPr>
               <w:tab/>
+            </w:r>
+            <w:r>
+              <w:rPr>
+                <w:noProof/>
+              </w:rPr>
               <w:fldChar w:fldCharType="begin"/>
+            </w:r>
+            <w:r>
+              <w:rPr>
+                <w:noProof/>
+              </w:rPr>
               <w:instrText xml:space="preserve"> PAGEREF _Toc238057064 \h </w:instrText>
+            </w:r>
+            <w:r>
+              <w:rPr>
+                <w:noProof/>
+              </w:rPr>
+            </w:r>
+            <w:r>
+              <w:rPr>
+                <w:noProof/>
+              </w:rPr>
               <w:fldChar w:fldCharType="separate"/>
+            </w:r>
+            <w:r>
+              <w:rPr>
+                <w:noProof/>
+              </w:rPr>
               <w:t>1</w:t>
+            </w:r>
+            <w:r>
+              <w:rPr>
+                <w:noProof/>
+              </w:rPr>
               <w:fldChar w:fldCharType="end"/>
             </w:r>
           </w:hyperlink>
@@ -2413,10 +4007,40 @@
                 <w:noProof/>
               </w:rPr>
               <w:tab/>
+            </w:r>
+            <w:r>
+              <w:rPr>
+                <w:noProof/>
+              </w:rPr>
               <w:fldChar w:fldCharType="begin"/>
+            </w:r>
+            <w:r>
+              <w:rPr>
+                <w:noProof/>
+              </w:rPr>
               <w:instrText xml:space="preserve"> PAGEREF _Toc238057065 \h </w:instrText>
+            </w:r>
+            <w:r>
+              <w:rPr>
+                <w:noProof/>
+              </w:rPr>
+            </w:r>
+            <w:r>
+              <w:rPr>
+                <w:noProof/>
+              </w:rPr>
               <w:fldChar w:fldCharType="separate"/>
+            </w:r>
+            <w:r>
+              <w:rPr>
+                <w:noProof/>
+              </w:rPr>
               <w:t>1</w:t>
+            </w:r>
+            <w:r>
+              <w:rPr>
+                <w:noProof/>
+              </w:rPr>
               <w:fldChar w:fldCharType="end"/>
             </w:r>
           </w:hyperlink>
@@ -2444,10 +4068,40 @@
                 <w:noProof/>
               </w:rPr>
               <w:tab/>
+            </w:r>
+            <w:r>
+              <w:rPr>
+                <w:noProof/>
+              </w:rPr>
               <w:fldChar w:fldCharType="begin"/>
+            </w:r>
+            <w:r>
+              <w:rPr>
+                <w:noProof/>
+              </w:rPr>
               <w:instrText xml:space="preserve"> PAGEREF _Toc238057066 \h </w:instrText>
+            </w:r>
+            <w:r>
+              <w:rPr>
+                <w:noProof/>
+              </w:rPr>
+            </w:r>
+            <w:r>
+              <w:rPr>
+                <w:noProof/>
+              </w:rPr>
               <w:fldChar w:fldCharType="separate"/>
+            </w:r>
+            <w:r>
+              <w:rPr>
+                <w:noProof/>
+              </w:rPr>
               <w:t>1</w:t>
+            </w:r>
+            <w:r>
+              <w:rPr>
+                <w:noProof/>
+              </w:rPr>
               <w:fldChar w:fldCharType="end"/>
             </w:r>
           </w:hyperlink>
@@ -2685,7 +4339,10 @@
               <w:spacing w:after="0"/>
             </w:pPr>
             <w:r>
-              <w:t>Defeudi, Nahuel Leandro</w:t>
+              <w:t>Defeudi Nahuel</w:t>
+            </w:r>
+            <w:r>
+              <w:t>, Daniel Cuomo</w:t>
             </w:r>
           </w:p>
         </w:tc>
@@ -4680,7 +6337,7 @@
         <w:jc w:val="both"/>
       </w:pPr>
       <w:r>
-        <w:t xml:space="preserve">e. Poscondiciones.</w:t>
+        <w:t>e. Poscondiciones.</w:t>
       </w:r>
     </w:p>
     <w:p>
@@ -5247,7 +6904,7 @@
           <w:iCs/>
           <w:color w:val="7F6000"/>
         </w:rPr>
-        <w:t xml:space="preserve">[PENDIENTE] Documentar, diseñar e implementar la arquitectura base: esquema de persistencia (detalle de lo que sucede dentro de la capa de acceso a datos para consulta y actualización), diagrama de componentes y mapa tentativo de navegación de los menús. Arquitectura de al menos cuatro capas, con criterios de POO (cohesión, acoplamiento, reuso). Se recomienda UI con formularios MDI.</w:t>
+        <w:t>[PENDIENTE] Documentar, diseñar e implementar la arquitectura base: esquema de persistencia (detalle de lo que sucede dentro de la capa de acceso a datos para consulta y actualización), diagrama de componentes y mapa tentativo de navegación de los menús. Arquitectura de al menos cuatro capas, con criterios de POO (cohesión, acoplamiento, reuso). Se recomienda UI con formularios MDI.</w:t>
       </w:r>
     </w:p>
     <w:p>
@@ -5256,7 +6913,7 @@
       </w:pPr>
       <w:bookmarkStart w:id="23" w:name="_Toc238057035"/>
       <w:r>
-        <w:t xml:space="preserve">T02. Gestión de Log In / Log Out del Sistema</w:t>
+        <w:t>T02. Gestión de Log In / Log Out del Sistema</w:t>
       </w:r>
       <w:bookmarkEnd w:id="23"/>
     </w:p>
@@ -5275,7 +6932,7 @@
         <w:jc w:val="both"/>
       </w:pPr>
       <w:r>
-        <w:t xml:space="preserve">Verificar la identidad del usuario a través del ingreso de su nombre de usuario y su clave, asignarle el perfil de permisos que tiene configurado en el sistema y mantener una única sesión activa durante toda la ejecución de la aplicación. La gestión es además responsable de dejar traza de todos los ingresos y egresos del sistema, y de coordinar los procesos que deben ejecutarse en el arranque, en el log-in, en el log-out y en el apagado.</w:t>
+        <w:t>Verificar la identidad del usuario a través del ingreso de su nombre de usuario y su clave, asignarle el perfil de permisos que tiene configurado en el sistema y mantener una única sesión activa durante toda la ejecución de la aplicación. La gestión es además responsable de dejar traza de todos los ingresos y egresos del sistema, y de coordinar los procesos que deben ejecutarse en el arranque, en el log-in, en el log-out y en el apagado.</w:t>
       </w:r>
     </w:p>
     <w:p>
@@ -5793,7 +7450,7 @@
         <w:jc w:val="both"/>
       </w:pPr>
       <w:r>
-        <w:t xml:space="preserve">El usuario ingresa nombre de usuario y contraseña. La contraseña nunca se almacena ni viaja en claro: se compara el hash calculado con el salt propio del usuario contra el hash persistido (ver T03. Gestión de Encriptado).</w:t>
+        <w:t>El usuario ingresa nombre de usuario y contraseña. La contraseña nunca se almacena ni viaja en claro: se compara el hash calculado con el salt propio del usuario contra el hash persistido (ver T03. Gestión de Encriptado).</w:t>
       </w:r>
     </w:p>
     <w:p>
@@ -5863,7 +7520,7 @@
         <w:jc w:val="both"/>
       </w:pPr>
       <w:r>
-        <w:t xml:space="preserve">Ante una validación exitosa se resetea el contador de intentos, se registra la fecha de último ingreso, se carga el árbol de permisos del usuario (ver T04) y se instancia la sesión.</w:t>
+        <w:t>Ante una validación exitosa se resetea el contador de intentos, se registra la fecha de último ingreso, se carga el árbol de permisos del usuario (ver T04) y se instancia la sesión.</w:t>
       </w:r>
     </w:p>
     <w:p>
@@ -5875,7 +7532,7 @@
           <w:b/>
           <w:bCs/>
         </w:rPr>
-        <w:t xml:space="preserve">Política de log-out y apagado del sistema</w:t>
+        <w:t>Política de log-out y apagado del sistema</w:t>
       </w:r>
     </w:p>
     <w:p>
@@ -5889,7 +7546,7 @@
         <w:jc w:val="both"/>
       </w:pPr>
       <w:r>
-        <w:t xml:space="preserve">El log-out destruye la instancia de la sesión, cierra el registro de sesión en la base indicando el motivo y registra el evento en la bitácora. La aplicación vuelve al formulario de log-in sin necesidad de reiniciarse.</w:t>
+        <w:t>El log-out destruye la instancia de la sesión, cierra el registro de sesión en la base indicando el motivo y registra el evento en la bitácora. La aplicación vuelve al formulario de log-in sin necesidad de reiniciarse.</w:t>
       </w:r>
     </w:p>
     <w:p>
@@ -5903,7 +7560,7 @@
         <w:jc w:val="both"/>
       </w:pPr>
       <w:r>
-        <w:t xml:space="preserve">El cierre de la aplicación equivale a un log-out implícito: se cierra la sesión con motivo «Cierre de aplicación» antes de liberar los recursos.</w:t>
+        <w:t>El cierre de la aplicación equivale a un log-out implícito: se cierra la sesión con motivo «Cierre de aplicación» antes de liberar los recursos.</w:t>
       </w:r>
     </w:p>
     <w:p>
@@ -5937,7 +7594,7 @@
         <w:jc w:val="both"/>
       </w:pPr>
       <w:r>
-        <w:t xml:space="preserve">La sesión se implementa con el patrón Singleton: la clase SessionManager tiene su constructor privado y expone la instancia única a través de un miembro estático. De esta manera cualquier capa del sistema puede consultar quién está logueado y qué permisos tiene, sin necesidad de propagar el objeto usuario por parámetro y sin riesgo de que existan dos sesiones simultáneas.</w:t>
+        <w:t>La sesión se implementa con el patrón Singleton: la clase SessionManager tiene su constructor privado y expone la instancia única a través de un miembro estático. De esta manera cualquier capa del sistema puede consultar quién está logueado y qué permisos tiene, sin necesidad de propagar el objeto usuario por parámetro y sin riesgo de que existan dos sesiones simultáneas.</w:t>
       </w:r>
     </w:p>
     <w:p>
@@ -5945,7 +7602,11 @@
         <w:jc w:val="both"/>
       </w:pPr>
       <w:r>
-        <w:t xml:space="preserve">El ciclo de vida de esa instancia se concentra en tres operaciones estáticas: Login la crea cuando todavía no existe y falla si ya hay una sesión abierta, GetInstance devuelve la sesión vigente y falla si nadie inició sesión, y Logout la destruye. Como el ingreso y la salida se disparan siempre desde el formulario principal, alcanza con verificar el campo estático antes de crear o de anular la instancia.</w:t>
+        <w:t xml:space="preserve">El ciclo de vida de esa instancia se concentra en tres operaciones estáticas: Login la crea cuando todavía no existe y falla si ya hay una sesión abierta, GetInstance devuelve la sesión vigente y falla si nadie inició sesión, y Logout la destruye. Como el ingreso y la salida se </w:t>
+      </w:r>
+      <w:r>
+        <w:lastRenderedPageBreak/>
+        <w:t>disparan siempre desde el formulario principal, alcanza con verificar el campo estático antes de crear o de anular la instancia.</w:t>
       </w:r>
     </w:p>
     <w:tbl>
@@ -6231,7 +7892,7 @@
               <w:spacing w:after="0"/>
             </w:pPr>
             <w:r>
-              <w:t xml:space="preserve">Que los datos del usuario anterior sigan accesibles después de haber cerrado la sesión.</w:t>
+              <w:t>Que los datos del usuario anterior sigan accesibles después de haber cerrado la sesión.</w:t>
             </w:r>
           </w:p>
         </w:tc>
@@ -6244,6 +7905,76 @@
       <w:r>
         <w:t>Esquema de la implementación:</w:t>
       </w:r>
+    </w:p>
+    <w:p>
+      <w:pPr>
+        <w:shd w:val="clear" w:color="auto" w:fill="F2F2F2"/>
+        <w:spacing w:after="0" w:line="200" w:lineRule="auto"/>
+      </w:pPr>
+      <w:proofErr w:type="spellStart"/>
+      <w:r>
+        <w:rPr>
+          <w:rFonts w:ascii="Consolas" w:eastAsia="Consolas" w:hAnsi="Consolas" w:cs="Consolas"/>
+          <w:sz w:val="18"/>
+          <w:szCs w:val="18"/>
+        </w:rPr>
+        <w:t>public</w:t>
+      </w:r>
+      <w:proofErr w:type="spellEnd"/>
+      <w:r>
+        <w:rPr>
+          <w:rFonts w:ascii="Consolas" w:eastAsia="Consolas" w:hAnsi="Consolas" w:cs="Consolas"/>
+          <w:sz w:val="18"/>
+          <w:szCs w:val="18"/>
+        </w:rPr>
+        <w:t xml:space="preserve"> </w:t>
+      </w:r>
+      <w:proofErr w:type="spellStart"/>
+      <w:r>
+        <w:rPr>
+          <w:rFonts w:ascii="Consolas" w:eastAsia="Consolas" w:hAnsi="Consolas" w:cs="Consolas"/>
+          <w:sz w:val="18"/>
+          <w:szCs w:val="18"/>
+        </w:rPr>
+        <w:t>sealed</w:t>
+      </w:r>
+      <w:proofErr w:type="spellEnd"/>
+      <w:r>
+        <w:rPr>
+          <w:rFonts w:ascii="Consolas" w:eastAsia="Consolas" w:hAnsi="Consolas" w:cs="Consolas"/>
+          <w:sz w:val="18"/>
+          <w:szCs w:val="18"/>
+        </w:rPr>
+        <w:t xml:space="preserve"> </w:t>
+      </w:r>
+      <w:proofErr w:type="spellStart"/>
+      <w:r>
+        <w:rPr>
+          <w:rFonts w:ascii="Consolas" w:eastAsia="Consolas" w:hAnsi="Consolas" w:cs="Consolas"/>
+          <w:sz w:val="18"/>
+          <w:szCs w:val="18"/>
+        </w:rPr>
+        <w:t>class</w:t>
+      </w:r>
+      <w:proofErr w:type="spellEnd"/>
+      <w:r>
+        <w:rPr>
+          <w:rFonts w:ascii="Consolas" w:eastAsia="Consolas" w:hAnsi="Consolas" w:cs="Consolas"/>
+          <w:sz w:val="18"/>
+          <w:szCs w:val="18"/>
+        </w:rPr>
+        <w:t xml:space="preserve"> </w:t>
+      </w:r>
+      <w:proofErr w:type="spellStart"/>
+      <w:r>
+        <w:rPr>
+          <w:rFonts w:ascii="Consolas" w:eastAsia="Consolas" w:hAnsi="Consolas" w:cs="Consolas"/>
+          <w:sz w:val="18"/>
+          <w:szCs w:val="18"/>
+        </w:rPr>
+        <w:t>SessionManager</w:t>
+      </w:r>
+      <w:proofErr w:type="spellEnd"/>
     </w:p>
     <w:p>
       <w:pPr>
@@ -6260,25 +7991,7 @@
           <w:szCs w:val="18"/>
           <w:lang w:val="en-US"/>
         </w:rPr>
-        <w:t xml:space="preserve">public sealed class SessionManager</w:t>
-      </w:r>
-    </w:p>
-    <w:p>
-      <w:pPr>
-        <w:shd w:val="clear" w:color="auto" w:fill="F2F2F2"/>
-        <w:spacing w:after="0" w:line="200" w:lineRule="auto"/>
-        <w:rPr>
-          <w:lang w:val="en-US"/>
-        </w:rPr>
-      </w:pPr>
-      <w:r>
-        <w:rPr>
-          <w:rFonts w:ascii="Consolas" w:eastAsia="Consolas" w:hAnsi="Consolas" w:cs="Consolas"/>
-          <w:sz w:val="18"/>
-          <w:szCs w:val="18"/>
-          <w:lang w:val="en-US"/>
-        </w:rPr>
-        <w:t xml:space="preserve">{</w:t>
+        <w:t>{</w:t>
       </w:r>
     </w:p>
     <w:p>
@@ -6546,9 +8259,6 @@
       <w:pPr>
         <w:shd w:val="clear" w:color="auto" w:fill="F2F2F2"/>
         <w:spacing w:after="0" w:line="200" w:lineRule="auto"/>
-        <w:rPr>
-          <w:lang w:val="en-US"/>
-        </w:rPr>
       </w:pPr>
       <w:r>
         <w:rPr>
@@ -6557,7 +8267,215 @@
           <w:szCs w:val="18"/>
           <w:lang w:val="en-US"/>
         </w:rPr>
-        <w:t xml:space="preserve">        var nueva = new SessionManager();</w:t>
+        <w:t xml:space="preserve">        </w:t>
+      </w:r>
+      <w:proofErr w:type="spellStart"/>
+      <w:r>
+        <w:rPr>
+          <w:rFonts w:ascii="Consolas" w:eastAsia="Consolas" w:hAnsi="Consolas" w:cs="Consolas"/>
+          <w:sz w:val="18"/>
+          <w:szCs w:val="18"/>
+        </w:rPr>
+        <w:t>var</w:t>
+      </w:r>
+      <w:proofErr w:type="spellEnd"/>
+      <w:r>
+        <w:rPr>
+          <w:rFonts w:ascii="Consolas" w:eastAsia="Consolas" w:hAnsi="Consolas" w:cs="Consolas"/>
+          <w:sz w:val="18"/>
+          <w:szCs w:val="18"/>
+        </w:rPr>
+        <w:t xml:space="preserve"> nueva = new </w:t>
+      </w:r>
+      <w:proofErr w:type="spellStart"/>
+      <w:proofErr w:type="gramStart"/>
+      <w:r>
+        <w:rPr>
+          <w:rFonts w:ascii="Consolas" w:eastAsia="Consolas" w:hAnsi="Consolas" w:cs="Consolas"/>
+          <w:sz w:val="18"/>
+          <w:szCs w:val="18"/>
+        </w:rPr>
+        <w:t>SessionManager</w:t>
+      </w:r>
+      <w:proofErr w:type="spellEnd"/>
+      <w:r>
+        <w:rPr>
+          <w:rFonts w:ascii="Consolas" w:eastAsia="Consolas" w:hAnsi="Consolas" w:cs="Consolas"/>
+          <w:sz w:val="18"/>
+          <w:szCs w:val="18"/>
+        </w:rPr>
+        <w:t>(</w:t>
+      </w:r>
+      <w:proofErr w:type="gramEnd"/>
+      <w:r>
+        <w:rPr>
+          <w:rFonts w:ascii="Consolas" w:eastAsia="Consolas" w:hAnsi="Consolas" w:cs="Consolas"/>
+          <w:sz w:val="18"/>
+          <w:szCs w:val="18"/>
+        </w:rPr>
+        <w:t>);</w:t>
+      </w:r>
+    </w:p>
+    <w:p>
+      <w:pPr>
+        <w:shd w:val="clear" w:color="auto" w:fill="F2F2F2"/>
+        <w:spacing w:after="0" w:line="200" w:lineRule="auto"/>
+      </w:pPr>
+      <w:r>
+        <w:rPr>
+          <w:rFonts w:ascii="Consolas" w:eastAsia="Consolas" w:hAnsi="Consolas" w:cs="Consolas"/>
+          <w:sz w:val="18"/>
+          <w:szCs w:val="18"/>
+        </w:rPr>
+        <w:t xml:space="preserve">        </w:t>
+      </w:r>
+      <w:proofErr w:type="spellStart"/>
+      <w:proofErr w:type="gramStart"/>
+      <w:r>
+        <w:rPr>
+          <w:rFonts w:ascii="Consolas" w:eastAsia="Consolas" w:hAnsi="Consolas" w:cs="Consolas"/>
+          <w:sz w:val="18"/>
+          <w:szCs w:val="18"/>
+        </w:rPr>
+        <w:t>nueva._</w:t>
+      </w:r>
+      <w:proofErr w:type="gramEnd"/>
+      <w:r>
+        <w:rPr>
+          <w:rFonts w:ascii="Consolas" w:eastAsia="Consolas" w:hAnsi="Consolas" w:cs="Consolas"/>
+          <w:sz w:val="18"/>
+          <w:szCs w:val="18"/>
+        </w:rPr>
+        <w:t>usuario</w:t>
+      </w:r>
+      <w:proofErr w:type="spellEnd"/>
+      <w:r>
+        <w:rPr>
+          <w:rFonts w:ascii="Consolas" w:eastAsia="Consolas" w:hAnsi="Consolas" w:cs="Consolas"/>
+          <w:sz w:val="18"/>
+          <w:szCs w:val="18"/>
+        </w:rPr>
+        <w:t xml:space="preserve"> = u;</w:t>
+      </w:r>
+    </w:p>
+    <w:p>
+      <w:pPr>
+        <w:shd w:val="clear" w:color="auto" w:fill="F2F2F2"/>
+        <w:spacing w:after="0" w:line="200" w:lineRule="auto"/>
+      </w:pPr>
+      <w:r>
+        <w:rPr>
+          <w:rFonts w:ascii="Consolas" w:eastAsia="Consolas" w:hAnsi="Consolas" w:cs="Consolas"/>
+          <w:sz w:val="18"/>
+          <w:szCs w:val="18"/>
+        </w:rPr>
+        <w:t xml:space="preserve">        </w:t>
+      </w:r>
+      <w:proofErr w:type="gramStart"/>
+      <w:r>
+        <w:rPr>
+          <w:rFonts w:ascii="Consolas" w:eastAsia="Consolas" w:hAnsi="Consolas" w:cs="Consolas"/>
+          <w:sz w:val="18"/>
+          <w:szCs w:val="18"/>
+        </w:rPr>
+        <w:t>nueva._</w:t>
+      </w:r>
+      <w:proofErr w:type="spellStart"/>
+      <w:proofErr w:type="gramEnd"/>
+      <w:r>
+        <w:rPr>
+          <w:rFonts w:ascii="Consolas" w:eastAsia="Consolas" w:hAnsi="Consolas" w:cs="Consolas"/>
+          <w:sz w:val="18"/>
+          <w:szCs w:val="18"/>
+        </w:rPr>
+        <w:t>idSesion</w:t>
+      </w:r>
+      <w:proofErr w:type="spellEnd"/>
+      <w:r>
+        <w:rPr>
+          <w:rFonts w:ascii="Consolas" w:eastAsia="Consolas" w:hAnsi="Consolas" w:cs="Consolas"/>
+          <w:sz w:val="18"/>
+          <w:szCs w:val="18"/>
+        </w:rPr>
+        <w:t xml:space="preserve"> = </w:t>
+      </w:r>
+      <w:proofErr w:type="spellStart"/>
+      <w:r>
+        <w:rPr>
+          <w:rFonts w:ascii="Consolas" w:eastAsia="Consolas" w:hAnsi="Consolas" w:cs="Consolas"/>
+          <w:sz w:val="18"/>
+          <w:szCs w:val="18"/>
+        </w:rPr>
+        <w:t>Guid.NewGuid</w:t>
+      </w:r>
+      <w:proofErr w:type="spellEnd"/>
+      <w:r>
+        <w:rPr>
+          <w:rFonts w:ascii="Consolas" w:eastAsia="Consolas" w:hAnsi="Consolas" w:cs="Consolas"/>
+          <w:sz w:val="18"/>
+          <w:szCs w:val="18"/>
+        </w:rPr>
+        <w:t>();</w:t>
+      </w:r>
+    </w:p>
+    <w:p>
+      <w:pPr>
+        <w:shd w:val="clear" w:color="auto" w:fill="F2F2F2"/>
+        <w:spacing w:after="0" w:line="200" w:lineRule="auto"/>
+      </w:pPr>
+      <w:r>
+        <w:rPr>
+          <w:rFonts w:ascii="Consolas" w:eastAsia="Consolas" w:hAnsi="Consolas" w:cs="Consolas"/>
+          <w:sz w:val="18"/>
+          <w:szCs w:val="18"/>
+        </w:rPr>
+        <w:t xml:space="preserve">        </w:t>
+      </w:r>
+      <w:proofErr w:type="gramStart"/>
+      <w:r>
+        <w:rPr>
+          <w:rFonts w:ascii="Consolas" w:eastAsia="Consolas" w:hAnsi="Consolas" w:cs="Consolas"/>
+          <w:sz w:val="18"/>
+          <w:szCs w:val="18"/>
+        </w:rPr>
+        <w:t>nueva._</w:t>
+      </w:r>
+      <w:proofErr w:type="spellStart"/>
+      <w:proofErr w:type="gramEnd"/>
+      <w:r>
+        <w:rPr>
+          <w:rFonts w:ascii="Consolas" w:eastAsia="Consolas" w:hAnsi="Consolas" w:cs="Consolas"/>
+          <w:sz w:val="18"/>
+          <w:szCs w:val="18"/>
+        </w:rPr>
+        <w:t>fechaInicio</w:t>
+      </w:r>
+      <w:proofErr w:type="spellEnd"/>
+      <w:r>
+        <w:rPr>
+          <w:rFonts w:ascii="Consolas" w:eastAsia="Consolas" w:hAnsi="Consolas" w:cs="Consolas"/>
+          <w:sz w:val="18"/>
+          <w:szCs w:val="18"/>
+        </w:rPr>
+        <w:t xml:space="preserve"> = </w:t>
+      </w:r>
+      <w:proofErr w:type="spellStart"/>
+      <w:r>
+        <w:rPr>
+          <w:rFonts w:ascii="Consolas" w:eastAsia="Consolas" w:hAnsi="Consolas" w:cs="Consolas"/>
+          <w:sz w:val="18"/>
+          <w:szCs w:val="18"/>
+        </w:rPr>
+        <w:t>DateTime.Now</w:t>
+      </w:r>
+      <w:proofErr w:type="spellEnd"/>
+      <w:r>
+        <w:rPr>
+          <w:rFonts w:ascii="Consolas" w:eastAsia="Consolas" w:hAnsi="Consolas" w:cs="Consolas"/>
+          <w:sz w:val="18"/>
+          <w:szCs w:val="18"/>
+        </w:rPr>
+        <w:t>;</w:t>
       </w:r>
     </w:p>
     <w:p>
@@ -6568,6 +8486,14 @@
           <w:lang w:val="en-US"/>
         </w:rPr>
       </w:pPr>
+      <w:r>
+        <w:rPr>
+          <w:rFonts w:ascii="Consolas" w:eastAsia="Consolas" w:hAnsi="Consolas" w:cs="Consolas"/>
+          <w:sz w:val="18"/>
+          <w:szCs w:val="18"/>
+        </w:rPr>
+        <w:t xml:space="preserve">        </w:t>
+      </w:r>
       <w:r>
         <w:rPr>
           <w:rFonts w:ascii="Consolas" w:eastAsia="Consolas" w:hAnsi="Consolas" w:cs="Consolas"/>
@@ -6575,17 +8501,9 @@
           <w:szCs w:val="18"/>
           <w:lang w:val="en-US"/>
         </w:rPr>
-        <w:t xml:space="preserve">        nueva._usuario = u;</w:t>
-      </w:r>
-    </w:p>
-    <w:p>
-      <w:pPr>
-        <w:shd w:val="clear" w:color="auto" w:fill="F2F2F2"/>
-        <w:spacing w:after="0" w:line="200" w:lineRule="auto"/>
-        <w:rPr>
-          <w:lang w:val="en-US"/>
-        </w:rPr>
-      </w:pPr>
+        <w:t>_</w:t>
+      </w:r>
+      <w:proofErr w:type="spellStart"/>
       <w:r>
         <w:rPr>
           <w:rFonts w:ascii="Consolas" w:eastAsia="Consolas" w:hAnsi="Consolas" w:cs="Consolas"/>
@@ -6593,17 +8511,9 @@
           <w:szCs w:val="18"/>
           <w:lang w:val="en-US"/>
         </w:rPr>
-        <w:t xml:space="preserve">        nueva._idSesion = Guid.NewGuid();</w:t>
-      </w:r>
-    </w:p>
-    <w:p>
-      <w:pPr>
-        <w:shd w:val="clear" w:color="auto" w:fill="F2F2F2"/>
-        <w:spacing w:after="0" w:line="200" w:lineRule="auto"/>
-        <w:rPr>
-          <w:lang w:val="en-US"/>
-        </w:rPr>
-      </w:pPr>
+        <w:t>instancia</w:t>
+      </w:r>
+      <w:proofErr w:type="spellEnd"/>
       <w:r>
         <w:rPr>
           <w:rFonts w:ascii="Consolas" w:eastAsia="Consolas" w:hAnsi="Consolas" w:cs="Consolas"/>
@@ -6611,17 +8521,9 @@
           <w:szCs w:val="18"/>
           <w:lang w:val="en-US"/>
         </w:rPr>
-        <w:t xml:space="preserve">        nueva._fechaInicio = DateTime.Now;</w:t>
-      </w:r>
-    </w:p>
-    <w:p>
-      <w:pPr>
-        <w:shd w:val="clear" w:color="auto" w:fill="F2F2F2"/>
-        <w:spacing w:after="0" w:line="200" w:lineRule="auto"/>
-        <w:rPr>
-          <w:lang w:val="en-US"/>
-        </w:rPr>
-      </w:pPr>
+        <w:t xml:space="preserve"> = </w:t>
+      </w:r>
+      <w:proofErr w:type="spellStart"/>
       <w:r>
         <w:rPr>
           <w:rFonts w:ascii="Consolas" w:eastAsia="Consolas" w:hAnsi="Consolas" w:cs="Consolas"/>
@@ -6629,7 +8531,17 @@
           <w:szCs w:val="18"/>
           <w:lang w:val="en-US"/>
         </w:rPr>
-        <w:t xml:space="preserve">        _instancia = nueva;</w:t>
+        <w:t>nueva</w:t>
+      </w:r>
+      <w:proofErr w:type="spellEnd"/>
+      <w:r>
+        <w:rPr>
+          <w:rFonts w:ascii="Consolas" w:eastAsia="Consolas" w:hAnsi="Consolas" w:cs="Consolas"/>
+          <w:sz w:val="18"/>
+          <w:szCs w:val="18"/>
+          <w:lang w:val="en-US"/>
+        </w:rPr>
+        <w:t>;</w:t>
       </w:r>
     </w:p>
     <w:p>
@@ -6717,9 +8629,6 @@
       <w:pPr>
         <w:shd w:val="clear" w:color="auto" w:fill="F2F2F2"/>
         <w:spacing w:after="0" w:line="200" w:lineRule="auto"/>
-        <w:rPr>
-          <w:lang w:val="en-US"/>
-        </w:rPr>
       </w:pPr>
       <w:r>
         <w:rPr>
@@ -6728,43 +8637,61 @@
           <w:szCs w:val="18"/>
           <w:lang w:val="en-US"/>
         </w:rPr>
-        <w:t xml:space="preserve">        _instancia = null;</w:t>
-      </w:r>
-    </w:p>
-    <w:p>
-      <w:pPr>
-        <w:shd w:val="clear" w:color="auto" w:fill="F2F2F2"/>
-        <w:spacing w:after="0" w:line="200" w:lineRule="auto"/>
-        <w:rPr>
-          <w:lang w:val="en-US"/>
-        </w:rPr>
-      </w:pPr>
+        <w:t xml:space="preserve">        </w:t>
+      </w:r>
       <w:r>
         <w:rPr>
           <w:rFonts w:ascii="Consolas" w:eastAsia="Consolas" w:hAnsi="Consolas" w:cs="Consolas"/>
           <w:sz w:val="18"/>
           <w:szCs w:val="18"/>
-          <w:lang w:val="en-US"/>
         </w:rPr>
-        <w:t xml:space="preserve">    }</w:t>
-      </w:r>
-    </w:p>
-    <w:p>
-      <w:pPr>
-        <w:shd w:val="clear" w:color="auto" w:fill="F2F2F2"/>
-        <w:spacing w:after="0" w:line="200" w:lineRule="auto"/>
-        <w:rPr>
-          <w:lang w:val="en-US"/>
-        </w:rPr>
-      </w:pPr>
+        <w:t xml:space="preserve">_instancia = </w:t>
+      </w:r>
+      <w:proofErr w:type="spellStart"/>
       <w:r>
         <w:rPr>
           <w:rFonts w:ascii="Consolas" w:eastAsia="Consolas" w:hAnsi="Consolas" w:cs="Consolas"/>
           <w:sz w:val="18"/>
           <w:szCs w:val="18"/>
-          <w:lang w:val="en-US"/>
         </w:rPr>
-        <w:t xml:space="preserve">}</w:t>
+        <w:t>null</w:t>
+      </w:r>
+      <w:proofErr w:type="spellEnd"/>
+      <w:r>
+        <w:rPr>
+          <w:rFonts w:ascii="Consolas" w:eastAsia="Consolas" w:hAnsi="Consolas" w:cs="Consolas"/>
+          <w:sz w:val="18"/>
+          <w:szCs w:val="18"/>
+        </w:rPr>
+        <w:t>;</w:t>
+      </w:r>
+    </w:p>
+    <w:p>
+      <w:pPr>
+        <w:shd w:val="clear" w:color="auto" w:fill="F2F2F2"/>
+        <w:spacing w:after="0" w:line="200" w:lineRule="auto"/>
+      </w:pPr>
+      <w:r>
+        <w:rPr>
+          <w:rFonts w:ascii="Consolas" w:eastAsia="Consolas" w:hAnsi="Consolas" w:cs="Consolas"/>
+          <w:sz w:val="18"/>
+          <w:szCs w:val="18"/>
+        </w:rPr>
+        <w:t xml:space="preserve">    }</w:t>
+      </w:r>
+    </w:p>
+    <w:p>
+      <w:pPr>
+        <w:shd w:val="clear" w:color="auto" w:fill="F2F2F2"/>
+        <w:spacing w:after="0" w:line="200" w:lineRule="auto"/>
+      </w:pPr>
+      <w:r>
+        <w:rPr>
+          <w:rFonts w:ascii="Consolas" w:eastAsia="Consolas" w:hAnsi="Consolas" w:cs="Consolas"/>
+          <w:sz w:val="18"/>
+          <w:szCs w:val="18"/>
+        </w:rPr>
+        <w:t>}</w:t>
       </w:r>
     </w:p>
     <w:p>
@@ -6782,7 +8709,8 @@
         <w:jc w:val="both"/>
       </w:pPr>
       <w:r>
-        <w:t xml:space="preserve">El formulario de log-in sólo captura las credenciales y muestra resultados; la lógica de autenticación vive en SesionBLL, que se apoya en UsuarioBLL para las reglas del usuario, en EncriptadorService para el hash y en PermisosBLL para armar el árbol de permisos. El acceso a datos queda aislado en los repositorios.</w:t>
+        <w:lastRenderedPageBreak/>
+        <w:t>El formulario de log-in sólo captura las credenciales y muestra resultados; la lógica de autenticación vive en SesionBLL, que se apoya en UsuarioBLL para las reglas del usuario, en EncriptadorService para el hash y en PermisosBLL para armar el árbol de permisos. El acceso a datos queda aislado en los repositorios.</w:t>
       </w:r>
     </w:p>
     <w:p>
@@ -6913,7 +8841,7 @@
           <w:sz w:val="18"/>
           <w:szCs w:val="18"/>
         </w:rPr>
-        <w:t xml:space="preserve">Figura T02.2 – SessionManager como Singleton</w:t>
+        <w:t>Figura T02.2 – SessionManager como Singleton</w:t>
       </w:r>
     </w:p>
     <w:p>
@@ -7097,36 +9025,39 @@
           <w:iCs/>
           <w:color w:val="7F6000"/>
         </w:rPr>
+        <w:t>[PENDIENTE] Algoritmos de encriptación para proteger los datos sensibles: un algoritmo simétrico o asimétrico para datos sensibles y un mecanismo de hash para las contraseñas.</w:t>
+      </w:r>
+    </w:p>
+    <w:p>
+      <w:pPr>
+        <w:pStyle w:val="Ttulo2"/>
+      </w:pPr>
+      <w:bookmarkStart w:id="30" w:name="_Toc238057042"/>
+      <w:r>
+        <w:t>T04. Gestión de Perfiles de Usuario</w:t>
+      </w:r>
+      <w:bookmarkEnd w:id="30"/>
+    </w:p>
+    <w:p>
+      <w:pPr>
+        <w:pStyle w:val="Ttulo3"/>
+      </w:pPr>
+      <w:bookmarkStart w:id="31" w:name="_Toc238057043"/>
+      <w:r>
+        <w:t>a) Objetivo</w:t>
+      </w:r>
+      <w:bookmarkEnd w:id="31"/>
+    </w:p>
+    <w:p>
+      <w:pPr>
+        <w:jc w:val="both"/>
+      </w:pPr>
+      <w:r>
+        <w:t xml:space="preserve">Permitir definir los permisos y los perfiles desde el propio sistema y asignarlos rápidamente a los usuarios. Un permiso es atómico cuando representa una única funcionalidad (patente) y </w:t>
+      </w:r>
+      <w:r>
         <w:lastRenderedPageBreak/>
-        <w:t>[PENDIENTE] Algoritmos de encriptación para proteger los datos sensibles: un algoritmo simétrico o asimétrico para datos sensibles y un mecanismo de hash para las contraseñas.</w:t>
-      </w:r>
-    </w:p>
-    <w:p>
-      <w:pPr>
-        <w:pStyle w:val="Ttulo2"/>
-      </w:pPr>
-      <w:bookmarkStart w:id="30" w:name="_Toc238057042"/>
-      <w:r>
-        <w:t>T04. Gestión de Perfiles de Usuario</w:t>
-      </w:r>
-      <w:bookmarkEnd w:id="30"/>
-    </w:p>
-    <w:p>
-      <w:pPr>
-        <w:pStyle w:val="Ttulo3"/>
-      </w:pPr>
-      <w:bookmarkStart w:id="31" w:name="_Toc238057043"/>
-      <w:r>
-        <w:t>a) Objetivo</w:t>
-      </w:r>
-      <w:bookmarkEnd w:id="31"/>
-    </w:p>
-    <w:p>
-      <w:pPr>
-        <w:jc w:val="both"/>
-      </w:pPr>
-      <w:r>
-        <w:t>Permitir definir los permisos y los perfiles desde el propio sistema y asignarlos rápidamente a los usuarios. Un permiso es atómico cuando representa una única funcionalidad (patente) y compuesto cuando agrupa a un conjunto de permisos (familia). El perfil de un usuario es, en definitiva, un permiso compuesto.</w:t>
+        <w:t>compuesto cuando agrupa a un conjunto de permisos (familia). El perfil de un usuario es, en definitiva, un permiso compuesto.</w:t>
       </w:r>
     </w:p>
     <w:p>
@@ -7487,7 +9418,7 @@
               <w:spacing w:after="0"/>
             </w:pPr>
             <w:r>
-              <w:t xml:space="preserve">SessionManager, PermisosBLL y los formularios</w:t>
+              <w:t>SessionManager, PermisosBLL y los formularios</w:t>
             </w:r>
           </w:p>
         </w:tc>
@@ -7764,7 +9695,6 @@
               <w:spacing w:after="0"/>
             </w:pPr>
             <w:r>
-              <w:lastRenderedPageBreak/>
               <w:t>OP002</w:t>
             </w:r>
           </w:p>
@@ -8175,6 +10105,7 @@
               <w:spacing w:after="0"/>
             </w:pPr>
             <w:r>
+              <w:lastRenderedPageBreak/>
               <w:t>GE050</w:t>
             </w:r>
           </w:p>
@@ -8496,7 +10427,7 @@
           <w:b/>
           <w:bCs/>
         </w:rPr>
-        <w:t xml:space="preserve">Visualización del árbol en un TreeView</w:t>
+        <w:t>Visualización del árbol en un TreeView</w:t>
       </w:r>
     </w:p>
     <w:p>
@@ -8504,7 +10435,7 @@
         <w:jc w:val="both"/>
       </w:pPr>
       <w:r>
-        <w:t xml:space="preserve">El árbol de permisos se muestra en un control de usuario tipo TreeView. La carga se realiza con una función recursiva que, por cada componente, crea un nodo y vuelve a invocarse sobre sus hijos; como la patente devuelve una colección de hijos vacía, la recursión corta sola en las hojas.</w:t>
+        <w:t>El árbol de permisos se muestra en un control de usuario tipo TreeView. La carga se realiza con una función recursiva que, por cada componente, crea un nodo y vuelve a invocarse sobre sus hijos; como la patente devuelve una colección de hijos vacía, la recursión corta sola en las hojas.</w:t>
       </w:r>
     </w:p>
     <w:p>
@@ -8518,7 +10449,7 @@
           <w:sz w:val="18"/>
           <w:szCs w:val="18"/>
         </w:rPr>
-        <w:t xml:space="preserve">private void CargarNodo(Componente c, TreeNodeCollection nodos)</w:t>
+        <w:t>private void CargarNodo(Componente c, TreeNodeCollection nodos)</w:t>
       </w:r>
     </w:p>
     <w:p>
@@ -8614,7 +10545,6 @@
           <w:b/>
           <w:bCs/>
         </w:rPr>
-        <w:lastRenderedPageBreak/>
         <w:t>Verificación de permisos</w:t>
       </w:r>
     </w:p>
@@ -8623,7 +10553,7 @@
         <w:jc w:val="both"/>
       </w:pPr>
       <w:r>
-        <w:t xml:space="preserve">Para saber si el usuario logueado puede ejecutar una funcionalidad, el sistema le pregunta a la sesión por la patente correspondiente. La consulta se resuelve recorriendo el árbol en profundidad: la patente compara su propio permiso y responde, mientras que la familia delega la pregunta en sus hijos y corta apenas uno responde afirmativamente. El código cliente es siempre el mismo, sin importar si el permiso asignado al usuario era una patente suelta o un perfil de varios niveles.</w:t>
+        <w:t>Para saber si el usuario logueado puede ejecutar una funcionalidad, el sistema le pregunta a la sesión por la patente correspondiente. La consulta se resuelve recorriendo el árbol en profundidad: la patente compara su propio permiso y responde, mientras que la familia delega la pregunta en sus hijos y corta apenas uno responde afirmativamente. El código cliente es siempre el mismo, sin importar si el permiso asignado al usuario era una patente suelta o un perfil de varios niveles.</w:t>
       </w:r>
     </w:p>
     <w:p>
@@ -8656,6 +10586,7 @@
           <w:szCs w:val="18"/>
           <w:lang w:val="en-US"/>
         </w:rPr>
+        <w:lastRenderedPageBreak/>
         <w:t xml:space="preserve">    </w:t>
       </w:r>
       <w:r>
@@ -8664,7 +10595,7 @@
           <w:sz w:val="18"/>
           <w:szCs w:val="18"/>
         </w:rPr>
-        <w:t xml:space="preserve">btnNuevoUsuario.Enabled = true;</w:t>
+        <w:t>btnNuevoUsuario.Enabled = true;</w:t>
       </w:r>
     </w:p>
     <w:p>
@@ -8692,7 +10623,7 @@
         <w:jc w:val="both"/>
       </w:pPr>
       <w:r>
-        <w:t xml:space="preserve">Patentes y familias se guardan en una única tabla de permisos, porque en el Composite ambas son el mismo tipo. Se distinguen por un atributo: si tiene valor se trata de una patente, y si está nulo se trata de una familia. La jerarquía se resuelve con una tabla de auto-relación padre-hijo y la asignación a usuarios con una tabla de relación usuario-permiso. La reconstrucción del árbol se hace con una consulta recursiva.</w:t>
+        <w:t>Patentes y familias se guardan en una única tabla de permisos, porque en el Composite ambas son el mismo tipo. Se distinguen por un atributo: si tiene valor se trata de una patente, y si está nulo se trata de una familia. La jerarquía se resuelve con una tabla de auto-relación padre-hijo y la asignación a usuarios con una tabla de relación usuario-permiso. La reconstrucción del árbol se hace con una consulta recursiva.</w:t>
       </w:r>
     </w:p>
     <w:p>
@@ -8832,7 +10763,7 @@
           <w:sz w:val="18"/>
           <w:szCs w:val="18"/>
         </w:rPr>
-        <w:t xml:space="preserve">SELECT r.id_permiso_padre, r.id_permiso_hijo, p.id, p.nombre, p.permiso</w:t>
+        <w:t>SELECT r.id_permiso_padre, r.id_permiso_hijo, p.id, p.nombre, p.permiso</w:t>
       </w:r>
     </w:p>
     <w:p>
@@ -8860,7 +10791,7 @@
           <w:sz w:val="18"/>
           <w:szCs w:val="18"/>
         </w:rPr>
-        <w:t xml:space="preserve">INNER JOIN permiso p ON r.id_permiso_hijo = p.id;</w:t>
+        <w:t>INNER JOIN permiso p ON r.id_permiso_hijo = p.id;</w:t>
       </w:r>
     </w:p>
     <w:p>
@@ -8901,7 +10832,7 @@
                     </pic:cNvPicPr>
                   </pic:nvPicPr>
                   <pic:blipFill>
-                    <a:blip r:embed="rId19"/>
+                    <a:blip r:embed="rId18"/>
                     <a:srcRect/>
                     <a:stretch>
                       <a:fillRect/>
@@ -8977,7 +10908,7 @@
                     </pic:cNvPicPr>
                   </pic:nvPicPr>
                   <pic:blipFill>
-                    <a:blip r:embed="rId20"/>
+                    <a:blip r:embed="rId19"/>
                     <a:srcRect/>
                     <a:stretch>
                       <a:fillRect/>
@@ -9053,7 +10984,7 @@
                     </pic:cNvPicPr>
                   </pic:nvPicPr>
                   <pic:blipFill>
-                    <a:blip r:embed="rId21"/>
+                    <a:blip r:embed="rId20"/>
                     <a:srcRect/>
                     <a:stretch>
                       <a:fillRect/>
@@ -9119,7 +11050,7 @@
                     </pic:cNvPicPr>
                   </pic:nvPicPr>
                   <pic:blipFill>
-                    <a:blip r:embed="rId22"/>
+                    <a:blip r:embed="rId21"/>
                     <a:srcRect/>
                     <a:stretch>
                       <a:fillRect/>
@@ -9178,7 +11109,7 @@
           <w:iCs/>
           <w:color w:val="7F6000"/>
         </w:rPr>
-        <w:t xml:space="preserve">[PENDIENTE] Cambio dinámico de idioma de todas las leyendas y títulos, con posibilidad de incorporar nuevos idiomas desde el sistema. Modelo reutilizable no acoplado a la UI, con patrón Observer y sin hojas de recursos estáticos.</w:t>
+        <w:t>[PENDIENTE] Cambio dinámico de idioma de todas las leyendas y títulos, con posibilidad de incorporar nuevos idiomas desde el sistema. Modelo reutilizable no acoplado a la UI, con patrón Observer y sin hojas de recursos estáticos.</w:t>
       </w:r>
     </w:p>
     <w:p>
@@ -9245,7 +11176,7 @@
       </w:pPr>
       <w:bookmarkStart w:id="40" w:name="_Toc238057052"/>
       <w:r>
-        <w:t xml:space="preserve">T07. Gestión de Backup</w:t>
+        <w:t>T07. Gestión de Backup</w:t>
       </w:r>
       <w:bookmarkEnd w:id="40"/>
     </w:p>
@@ -9261,7 +11192,7 @@
           <w:color w:val="7F6000"/>
         </w:rPr>
         <w:lastRenderedPageBreak/>
-        <w:t xml:space="preserve">[PENDIENTE] Administración de las copias de seguridad: catálogo de backups y archivos físicos con la información resguardada.</w:t>
+        <w:t>[PENDIENTE] Administración de las copias de seguridad: catálogo de backups y archivos físicos con la información resguardada.</w:t>
       </w:r>
     </w:p>
     <w:p>
@@ -9291,8 +11222,8 @@
     <w:p>
       <w:pPr>
         <w:sectPr>
-          <w:headerReference w:type="default" r:id="rId23"/>
-          <w:footerReference w:type="default" r:id="rId24"/>
+          <w:headerReference w:type="default" r:id="rId22"/>
+          <w:footerReference w:type="default" r:id="rId23"/>
           <w:pgSz w:w="11905" w:h="16837"/>
           <w:pgMar w:top="2267" w:right="1133" w:bottom="850" w:left="1700" w:header="566" w:footer="396" w:gutter="0"/>
           <w:cols w:space="720"/>
@@ -9386,8 +11317,8 @@
     <w:p>
       <w:pPr>
         <w:sectPr>
-          <w:headerReference w:type="default" r:id="rId25"/>
-          <w:footerReference w:type="default" r:id="rId26"/>
+          <w:headerReference w:type="default" r:id="rId24"/>
+          <w:footerReference w:type="default" r:id="rId25"/>
           <w:pgSz w:w="11905" w:h="16837"/>
           <w:pgMar w:top="2267" w:right="1133" w:bottom="850" w:left="1700" w:header="566" w:footer="396" w:gutter="0"/>
           <w:cols w:space="720"/>
@@ -9481,8 +11412,8 @@
     <w:p>
       <w:pPr>
         <w:sectPr>
-          <w:headerReference w:type="default" r:id="rId27"/>
-          <w:footerReference w:type="default" r:id="rId28"/>
+          <w:headerReference w:type="default" r:id="rId26"/>
+          <w:footerReference w:type="default" r:id="rId27"/>
           <w:pgSz w:w="11905" w:h="16837"/>
           <w:pgMar w:top="2267" w:right="1133" w:bottom="850" w:left="1700" w:header="566" w:footer="396" w:gutter="0"/>
           <w:cols w:space="720"/>
@@ -9512,7 +11443,7 @@
           <w:iCs/>
           <w:color w:val="7F6000"/>
         </w:rPr>
-        <w:t xml:space="preserve">[PENDIENTE] Arquitectura diseñada (≥4 capas, POO, persistencia propia sin frameworks de terceros) · Balanceo de diagramas de clases, DER, casos de uso y diagramas de secuencia con la implementación · Interfaz de usuario · Calidad de código y POO · Diseño de base de datos (integridad referencial, 3FN) · Presentación general.</w:t>
+        <w:t>[PENDIENTE] Arquitectura diseñada (≥4 capas, POO, persistencia propia sin frameworks de terceros) · Balanceo de diagramas de clases, DER, casos de uso y diagramas de secuencia con la implementación · Interfaz de usuario · Calidad de código y POO · Diseño de base de datos (integridad referencial, 3FN) · Presentación general.</w:t>
       </w:r>
     </w:p>
     <w:p>
@@ -10101,8 +12032,8 @@
       </w:r>
     </w:p>
     <w:sectPr>
-      <w:headerReference w:type="default" r:id="rId29"/>
-      <w:footerReference w:type="default" r:id="rId30"/>
+      <w:headerReference w:type="default" r:id="rId28"/>
+      <w:footerReference w:type="default" r:id="rId29"/>
       <w:pgSz w:w="11905" w:h="16837"/>
       <w:pgMar w:top="2267" w:right="1133" w:bottom="850" w:left="1700" w:header="566" w:footer="396" w:gutter="0"/>
       <w:cols w:space="720"/>

</xml_diff>